<commit_message>
SEQUOIADBMAINSTREAM-3925 【story】SequoiaDB支持Amazon S3接口 -HEAD接口 补充HEAD Bucket的和Head object的java sdk接口
git-svn-id: http://192.168.20.11/sequoiadb/trunk@37712 6121f079-4a18-41d3-8c30-8870a322f2c2
</commit_message>
<xml_diff>
--- a/internal_doc/03.开发设计/Amazon S3接口兼容/Story--SequoiaDB兼容Amazon S3接口 -对象管理.docx
+++ b/internal_doc/03.开发设计/Amazon S3接口兼容/Story--SequoiaDB兼容Amazon S3接口 -对象管理.docx
@@ -3711,7 +3711,21 @@
         <w:ind w:left="630"/>
       </w:pPr>
       <w:r>
-        <w:t>GET Bucket (List Objects) Version 2</w:t>
+        <w:t>GE</w:t>
+      </w:r>
+      <w:commentRangeStart w:id="0"/>
+      <w:r>
+        <w:t>T Bucket (List Objects) Version 2</w:t>
+      </w:r>
+      <w:commentRangeEnd w:id="0"/>
+      <w:r>
+        <w:rPr>
+          <w:rStyle w:val="af"/>
+          <w:rFonts w:eastAsiaTheme="minorEastAsia"/>
+          <w:b w:val="0"/>
+          <w:bCs w:val="0"/>
+        </w:rPr>
+        <w:commentReference w:id="0"/>
       </w:r>
     </w:p>
     <w:p>
@@ -7651,16 +7665,8 @@
             <w:pPr>
               <w:ind w:left="0"/>
             </w:pPr>
-            <w:commentRangeStart w:id="0"/>
             <w:r>
               <w:t>Container for version information.</w:t>
-            </w:r>
-            <w:commentRangeEnd w:id="0"/>
-            <w:r>
-              <w:rPr>
-                <w:rStyle w:val="af"/>
-              </w:rPr>
-              <w:commentReference w:id="0"/>
             </w:r>
           </w:p>
           <w:p>
@@ -8804,9 +8810,6 @@
     <w:p>
       <w:pPr>
         <w:ind w:left="0" w:firstLineChars="200" w:firstLine="420"/>
-        <w:rPr>
-          <w:rFonts w:hint="eastAsia"/>
-        </w:rPr>
       </w:pPr>
       <w:r>
         <w:rPr>
@@ -8859,9 +8862,6 @@
     <w:p>
       <w:pPr>
         <w:ind w:left="0" w:firstLineChars="200" w:firstLine="420"/>
-        <w:rPr>
-          <w:rFonts w:hint="eastAsia"/>
-        </w:rPr>
       </w:pPr>
       <w:r>
         <w:rPr>
@@ -8885,9 +8885,6 @@
     <w:p>
       <w:pPr>
         <w:ind w:left="0" w:firstLineChars="200" w:firstLine="420"/>
-        <w:rPr>
-          <w:rFonts w:hint="eastAsia"/>
-        </w:rPr>
       </w:pPr>
       <w:r>
         <w:rPr>
@@ -9526,9 +9523,6 @@
     <w:p>
       <w:pPr>
         <w:ind w:left="0" w:firstLineChars="200" w:firstLine="420"/>
-        <w:rPr>
-          <w:rFonts w:hint="eastAsia"/>
-        </w:rPr>
       </w:pPr>
       <w:r>
         <w:rPr>
@@ -11416,9 +11410,6 @@
     <w:p>
       <w:pPr>
         <w:ind w:left="0" w:firstLineChars="200" w:firstLine="420"/>
-        <w:rPr>
-          <w:rFonts w:hint="eastAsia"/>
-        </w:rPr>
       </w:pPr>
     </w:p>
     <w:p>
@@ -11441,9 +11432,6 @@
     <w:p>
       <w:pPr>
         <w:ind w:left="0" w:firstLineChars="200" w:firstLine="420"/>
-        <w:rPr>
-          <w:rFonts w:hint="eastAsia"/>
-        </w:rPr>
       </w:pPr>
       <w:r>
         <w:rPr>
@@ -11461,19 +11449,7 @@
         <w:rPr>
           <w:rFonts w:hint="eastAsia"/>
         </w:rPr>
-        <w:t>指定</w:t>
-      </w:r>
-      <w:r>
-        <w:rPr>
-          <w:rFonts w:hint="eastAsia"/>
-        </w:rPr>
-        <w:t>检查是否有</w:t>
-      </w:r>
-      <w:r>
-        <w:rPr>
-          <w:rFonts w:hint="eastAsia"/>
-        </w:rPr>
-        <w:t>某个版本的对象。</w:t>
+        <w:t>指定检查是否有某个版本的对象。</w:t>
       </w:r>
     </w:p>
     <w:tbl>
@@ -11659,25 +11635,7 @@
         <w:rPr>
           <w:rFonts w:hint="eastAsia"/>
         </w:rPr>
-        <w:t>检查</w:t>
-      </w:r>
-      <w:r>
-        <w:rPr>
-          <w:rFonts w:hint="eastAsia"/>
-        </w:rPr>
-        <w:t>对象</w:t>
-      </w:r>
-      <w:r>
-        <w:rPr>
-          <w:rFonts w:hint="eastAsia"/>
-        </w:rPr>
-        <w:t>是否有指定范围</w:t>
-      </w:r>
-      <w:r>
-        <w:rPr>
-          <w:rFonts w:hint="eastAsia"/>
-        </w:rPr>
-        <w:t>内容。</w:t>
+        <w:t>检查对象是否有指定范围内容。</w:t>
       </w:r>
     </w:p>
     <w:p>
@@ -11730,9 +11688,6 @@
     <w:p>
       <w:pPr>
         <w:ind w:left="0" w:firstLineChars="200" w:firstLine="420"/>
-        <w:rPr>
-          <w:rFonts w:hint="eastAsia"/>
-        </w:rPr>
       </w:pPr>
       <w:r>
         <w:rPr>
@@ -14924,7 +14879,7 @@
         <w:rPr>
           <w:rFonts w:hint="eastAsia"/>
         </w:rPr>
-        <w:t>V</w:t>
+        <w:t>v</w:t>
       </w:r>
       <w:r>
         <w:t>ersions</w:t>
@@ -17089,6 +17044,8 @@
         <w:pStyle w:val="3"/>
         <w:ind w:left="630"/>
       </w:pPr>
+      <w:bookmarkStart w:id="1" w:name="_GoBack"/>
+      <w:bookmarkEnd w:id="1"/>
       <w:r>
         <w:rPr>
           <w:rFonts w:hint="eastAsia"/>
@@ -17124,9 +17081,6 @@
           <w:p>
             <w:pPr>
               <w:ind w:left="0"/>
-              <w:rPr>
-                <w:rFonts w:hint="eastAsia"/>
-              </w:rPr>
             </w:pPr>
             <w:r>
               <w:rPr>
@@ -17143,9 +17097,6 @@
           <w:p>
             <w:pPr>
               <w:ind w:left="0"/>
-              <w:rPr>
-                <w:rFonts w:hint="eastAsia"/>
-              </w:rPr>
             </w:pPr>
             <w:r>
               <w:rPr>
@@ -17217,9 +17168,6 @@
           <w:p>
             <w:pPr>
               <w:ind w:left="0"/>
-              <w:rPr>
-                <w:rFonts w:hint="eastAsia"/>
-              </w:rPr>
             </w:pPr>
             <w:r>
               <w:rPr>
@@ -17245,9 +17193,6 @@
           <w:p>
             <w:pPr>
               <w:ind w:left="0"/>
-              <w:rPr>
-                <w:rFonts w:hint="eastAsia"/>
-              </w:rPr>
             </w:pPr>
             <w:r>
               <w:rPr>
@@ -17350,12 +17295,290 @@
           <w:p>
             <w:pPr>
               <w:ind w:left="0"/>
-              <w:rPr>
-                <w:rFonts w:hint="eastAsia"/>
-              </w:rPr>
             </w:pPr>
             <w:r>
               <w:t>amazonS3.doesObjectExist(bucket, object);</w:t>
+            </w:r>
+          </w:p>
+        </w:tc>
+      </w:tr>
+    </w:tbl>
+    <w:p/>
+    <w:tbl>
+      <w:tblPr>
+        <w:tblStyle w:val="a9"/>
+        <w:tblW w:w="0" w:type="auto"/>
+        <w:tblInd w:w="748" w:type="dxa"/>
+        <w:tblLook w:val="04A0" w:firstRow="1" w:lastRow="0" w:firstColumn="1" w:lastColumn="0" w:noHBand="0" w:noVBand="1"/>
+      </w:tblPr>
+      <w:tblGrid>
+        <w:gridCol w:w="3774"/>
+        <w:gridCol w:w="3774"/>
+      </w:tblGrid>
+      <w:tr>
+        <w:tc>
+          <w:tcPr>
+            <w:tcW w:w="3774" w:type="dxa"/>
+          </w:tcPr>
+          <w:p>
+            <w:pPr>
+              <w:ind w:left="0"/>
+            </w:pPr>
+            <w:r>
+              <w:rPr>
+                <w:rFonts w:hint="eastAsia"/>
+              </w:rPr>
+              <w:t>接口</w:t>
+            </w:r>
+          </w:p>
+        </w:tc>
+        <w:tc>
+          <w:tcPr>
+            <w:tcW w:w="3774" w:type="dxa"/>
+          </w:tcPr>
+          <w:p>
+            <w:pPr>
+              <w:ind w:left="0"/>
+            </w:pPr>
+            <w:r>
+              <w:rPr>
+                <w:rFonts w:hint="eastAsia"/>
+              </w:rPr>
+              <w:t>作用</w:t>
+            </w:r>
+          </w:p>
+        </w:tc>
+      </w:tr>
+      <w:tr>
+        <w:tc>
+          <w:tcPr>
+            <w:tcW w:w="3774" w:type="dxa"/>
+          </w:tcPr>
+          <w:p>
+            <w:pPr>
+              <w:ind w:left="0"/>
+            </w:pPr>
+            <w:r>
+              <w:t>getObjectMetadata</w:t>
+            </w:r>
+          </w:p>
+          <w:p>
+            <w:pPr>
+              <w:ind w:left="0"/>
+            </w:pPr>
+            <w:r>
+              <w:rPr>
+                <w:rFonts w:hint="eastAsia"/>
+              </w:rPr>
+              <w:t>参数：</w:t>
+            </w:r>
+          </w:p>
+          <w:p>
+            <w:pPr>
+              <w:ind w:left="0"/>
+            </w:pPr>
+            <w:r>
+              <w:t>GetObjectMetadataRequest</w:t>
+            </w:r>
+          </w:p>
+          <w:p>
+            <w:pPr>
+              <w:ind w:left="0"/>
+            </w:pPr>
+            <w:r>
+              <w:rPr>
+                <w:rFonts w:hint="eastAsia"/>
+              </w:rPr>
+              <w:t>返回值：</w:t>
+            </w:r>
+            <w:r>
+              <w:t>ObjectMetadata</w:t>
+            </w:r>
+          </w:p>
+        </w:tc>
+        <w:tc>
+          <w:tcPr>
+            <w:tcW w:w="3774" w:type="dxa"/>
+          </w:tcPr>
+          <w:p>
+            <w:pPr>
+              <w:ind w:left="0"/>
+            </w:pPr>
+            <w:r>
+              <w:rPr>
+                <w:rFonts w:hint="eastAsia"/>
+              </w:rPr>
+              <w:t>发送</w:t>
+            </w:r>
+            <w:r>
+              <w:rPr>
+                <w:rFonts w:hint="eastAsia"/>
+              </w:rPr>
+              <w:t xml:space="preserve">HEAD </w:t>
+            </w:r>
+            <w:r>
+              <w:t>Object</w:t>
+            </w:r>
+            <w:r>
+              <w:rPr>
+                <w:rFonts w:hint="eastAsia"/>
+              </w:rPr>
+              <w:t>请求并处理响应</w:t>
+            </w:r>
+            <w:r>
+              <w:rPr>
+                <w:rFonts w:hint="eastAsia"/>
+              </w:rPr>
+              <w:t>，返回对象的元数据</w:t>
+            </w:r>
+          </w:p>
+        </w:tc>
+      </w:tr>
+      <w:tr>
+        <w:tc>
+          <w:tcPr>
+            <w:tcW w:w="3774" w:type="dxa"/>
+          </w:tcPr>
+          <w:p>
+            <w:pPr>
+              <w:ind w:left="0"/>
+            </w:pPr>
+            <w:r>
+              <w:t>GetObjectMetadataRequest</w:t>
+            </w:r>
+          </w:p>
+          <w:p>
+            <w:pPr>
+              <w:ind w:left="0"/>
+            </w:pPr>
+            <w:r>
+              <w:rPr>
+                <w:rFonts w:hint="eastAsia"/>
+              </w:rPr>
+              <w:t>参数：</w:t>
+            </w:r>
+          </w:p>
+          <w:p>
+            <w:pPr>
+              <w:ind w:left="0"/>
+            </w:pPr>
+            <w:r>
+              <w:t>String bucketName</w:t>
+            </w:r>
+          </w:p>
+          <w:p>
+            <w:pPr>
+              <w:ind w:left="0"/>
+            </w:pPr>
+            <w:r>
+              <w:t>String key</w:t>
+            </w:r>
+          </w:p>
+          <w:p>
+            <w:pPr>
+              <w:ind w:left="0"/>
+            </w:pPr>
+            <w:r>
+              <w:t>String versionId</w:t>
+            </w:r>
+          </w:p>
+          <w:p>
+            <w:pPr>
+              <w:ind w:left="0"/>
+              <w:rPr>
+                <w:rFonts w:hint="eastAsia"/>
+              </w:rPr>
+            </w:pPr>
+            <w:r>
+              <w:rPr>
+                <w:rFonts w:hint="eastAsia"/>
+              </w:rPr>
+              <w:t>返回值：</w:t>
+            </w:r>
+            <w:r>
+              <w:t>GetObjectMetadataRequest</w:t>
+            </w:r>
+          </w:p>
+        </w:tc>
+        <w:tc>
+          <w:tcPr>
+            <w:tcW w:w="3774" w:type="dxa"/>
+          </w:tcPr>
+          <w:p>
+            <w:pPr>
+              <w:ind w:left="0"/>
+              <w:rPr>
+                <w:rFonts w:hint="eastAsia"/>
+              </w:rPr>
+            </w:pPr>
+            <w:r>
+              <w:rPr>
+                <w:rFonts w:hint="eastAsia"/>
+              </w:rPr>
+              <w:t>构造</w:t>
+            </w:r>
+            <w:r>
+              <w:t>getObjectMetadata</w:t>
+            </w:r>
+            <w:r>
+              <w:rPr>
+                <w:rFonts w:hint="eastAsia"/>
+              </w:rPr>
+              <w:t>的请求</w:t>
+            </w:r>
+          </w:p>
+        </w:tc>
+      </w:tr>
+    </w:tbl>
+    <w:p/>
+    <w:p>
+      <w:r>
+        <w:rPr>
+          <w:rFonts w:hint="eastAsia"/>
+        </w:rPr>
+        <w:t>样例：</w:t>
+      </w:r>
+    </w:p>
+    <w:tbl>
+      <w:tblPr>
+        <w:tblStyle w:val="a9"/>
+        <w:tblW w:w="0" w:type="auto"/>
+        <w:tblInd w:w="748" w:type="dxa"/>
+        <w:tblLook w:val="04A0" w:firstRow="1" w:lastRow="0" w:firstColumn="1" w:lastColumn="0" w:noHBand="0" w:noVBand="1"/>
+      </w:tblPr>
+      <w:tblGrid>
+        <w:gridCol w:w="7548"/>
+      </w:tblGrid>
+      <w:tr>
+        <w:tc>
+          <w:tcPr>
+            <w:tcW w:w="8296" w:type="dxa"/>
+          </w:tcPr>
+          <w:p>
+            <w:pPr>
+              <w:ind w:left="0"/>
+            </w:pPr>
+            <w:r>
+              <w:t xml:space="preserve">GetObjectMetadataRequest request = </w:t>
+            </w:r>
+          </w:p>
+          <w:p>
+            <w:pPr>
+              <w:ind w:left="0" w:firstLineChars="1000" w:firstLine="2100"/>
+            </w:pPr>
+            <w:r>
+              <w:t>new GetObjectMetadataRequest(bucket, object, versionId);</w:t>
+            </w:r>
+          </w:p>
+          <w:p>
+            <w:pPr>
+              <w:ind w:left="0"/>
+              <w:rPr>
+                <w:rFonts w:hint="eastAsia"/>
+              </w:rPr>
+            </w:pPr>
+            <w:r>
+              <w:t>ObjectMetadata result = amazonS3.getObjectMetadata(request);</w:t>
             </w:r>
           </w:p>
         </w:tc>
@@ -17372,8 +17595,8 @@
       <w:pPr>
         <w:pStyle w:val="10"/>
       </w:pPr>
-      <w:bookmarkStart w:id="1" w:name="_公共头部"/>
-      <w:bookmarkEnd w:id="1"/>
+      <w:bookmarkStart w:id="2" w:name="_公共头部"/>
+      <w:bookmarkEnd w:id="2"/>
       <w:r>
         <w:rPr>
           <w:rFonts w:hint="eastAsia"/>
@@ -17549,6 +17772,7 @@
         <w:rPr>
           <w:rFonts w:hint="eastAsia"/>
         </w:rPr>
+        <w:lastRenderedPageBreak/>
         <w:t>S</w:t>
       </w:r>
       <w:r>
@@ -18225,7 +18449,6 @@
               <w:rPr>
                 <w:rFonts w:hint="eastAsia"/>
               </w:rPr>
-              <w:lastRenderedPageBreak/>
               <w:t>DELETE</w:t>
             </w:r>
           </w:p>
@@ -19116,6 +19339,7 @@
               <w:rPr>
                 <w:rFonts w:hint="eastAsia"/>
               </w:rPr>
+              <w:lastRenderedPageBreak/>
               <w:t>版本控制状态</w:t>
             </w:r>
           </w:p>
@@ -19540,14 +19764,7 @@
               <w:rPr>
                 <w:rFonts w:hint="eastAsia"/>
               </w:rPr>
-              <w:t>更新最新对象元数据表中的元数据，旧元数据写入历史对象元数据</w:t>
-            </w:r>
-            <w:r>
-              <w:rPr>
-                <w:rFonts w:hint="eastAsia"/>
-              </w:rPr>
-              <w:lastRenderedPageBreak/>
-              <w:t>表，旧的对象数据不删除。</w:t>
+              <w:t>更新最新对象元数据表中的元数据，旧元数据写入历史对象元数据表，旧的对象数据不删除。</w:t>
             </w:r>
           </w:p>
         </w:tc>
@@ -19564,7 +19781,6 @@
               <w:rPr>
                 <w:rFonts w:hint="eastAsia"/>
               </w:rPr>
-              <w:lastRenderedPageBreak/>
               <w:t>更新最新对象元数据表中的元数据，旧元数据的</w:t>
             </w:r>
             <w:r>
@@ -19604,14 +19820,7 @@
               <w:rPr>
                 <w:rFonts w:hint="eastAsia"/>
               </w:rPr>
-              <w:t>如果不</w:t>
-            </w:r>
-            <w:r>
-              <w:rPr>
-                <w:rFonts w:hint="eastAsia"/>
-              </w:rPr>
-              <w:lastRenderedPageBreak/>
-              <w:t>为</w:t>
+              <w:t>如果不为</w:t>
             </w:r>
             <w:r>
               <w:rPr>
@@ -19642,7 +19851,6 @@
               <w:rPr>
                 <w:rFonts w:hint="eastAsia"/>
               </w:rPr>
-              <w:lastRenderedPageBreak/>
               <w:t>元数据</w:t>
             </w:r>
             <w:r>
@@ -20068,6 +20276,7 @@
         <w:rPr>
           <w:rFonts w:hint="eastAsia"/>
         </w:rPr>
+        <w:lastRenderedPageBreak/>
         <w:t>元数据集合空间下的最新元数据集合名为</w:t>
       </w:r>
       <w:r>
@@ -20412,7 +20621,6 @@
         <w:ind w:left="0"/>
       </w:pPr>
       <w:r>
-        <w:lastRenderedPageBreak/>
         <w:t>Version</w:t>
       </w:r>
       <w:r>
@@ -20499,6 +20707,7 @@
         </w:rPr>
       </w:pPr>
       <w:r>
+        <w:lastRenderedPageBreak/>
         <w:t xml:space="preserve"> </w:t>
       </w:r>
       <w:r>
@@ -20597,7 +20806,6 @@
         <w:rPr>
           <w:rFonts w:hint="eastAsia"/>
         </w:rPr>
-        <w:lastRenderedPageBreak/>
         <w:t>QueryForUpdate</w:t>
       </w:r>
       <w:r>
@@ -20698,6 +20906,7 @@
         <w:rPr>
           <w:rFonts w:hint="eastAsia"/>
         </w:rPr>
+        <w:lastRenderedPageBreak/>
         <w:t>先将原最新元数据写入历史元数据表，再更新最新元数据，避免原最新元数据在一部分时刻在最新元数据表和历史元数据表都查询不到任何关于此版本的记录。</w:t>
       </w:r>
     </w:p>
@@ -20718,7 +20927,7 @@
         </w:rPr>
         <w:t>增加对象的并发场景：</w:t>
       </w:r>
-      <w:commentRangeStart w:id="2"/>
+      <w:commentRangeStart w:id="3"/>
     </w:p>
     <w:p>
       <w:pPr>
@@ -20754,12 +20963,12 @@
         </w:rPr>
         <w:t>查询元数据时发现</w:t>
       </w:r>
-      <w:commentRangeEnd w:id="2"/>
+      <w:commentRangeEnd w:id="3"/>
       <w:r>
         <w:rPr>
           <w:rStyle w:val="af"/>
         </w:rPr>
-        <w:commentReference w:id="2"/>
+        <w:commentReference w:id="3"/>
       </w:r>
       <w:r>
         <w:rPr>
@@ -21338,15 +21547,14 @@
         <w:pStyle w:val="3"/>
         <w:ind w:left="630"/>
       </w:pPr>
-      <w:bookmarkStart w:id="3" w:name="_查询对象（List_Objects_v2）"/>
-      <w:bookmarkStart w:id="4" w:name="_查询对象（GET_Bucket_(List"/>
-      <w:bookmarkEnd w:id="3"/>
+      <w:bookmarkStart w:id="4" w:name="_查询对象（List_Objects_v2）"/>
+      <w:bookmarkStart w:id="5" w:name="_查询对象（GET_Bucket_(List"/>
       <w:bookmarkEnd w:id="4"/>
-      <w:r>
-        <w:rPr>
-          <w:rFonts w:hint="eastAsia"/>
-        </w:rPr>
-        <w:lastRenderedPageBreak/>
+      <w:bookmarkEnd w:id="5"/>
+      <w:r>
+        <w:rPr>
+          <w:rFonts w:hint="eastAsia"/>
+        </w:rPr>
         <w:t>查询对象（</w:t>
       </w:r>
       <w:r>
@@ -21428,6 +21636,7 @@
         <w:rPr>
           <w:rStyle w:val="afd"/>
         </w:rPr>
+        <w:lastRenderedPageBreak/>
         <w:t>筛选条件</w:t>
       </w:r>
     </w:p>
@@ -22426,6 +22635,7 @@
         <w:rPr>
           <w:rFonts w:hint="eastAsia"/>
         </w:rPr>
+        <w:lastRenderedPageBreak/>
         <w:t>{</w:t>
       </w:r>
     </w:p>
@@ -23835,16 +24045,16 @@
         </w:rPr>
         <w:t>。</w:t>
       </w:r>
-      <w:bookmarkStart w:id="5" w:name="_查询版本（GET_Bucket_Object"/>
-      <w:bookmarkEnd w:id="5"/>
+      <w:bookmarkStart w:id="6" w:name="_查询版本（GET_Bucket_Object"/>
+      <w:bookmarkEnd w:id="6"/>
     </w:p>
     <w:p>
       <w:pPr>
         <w:pStyle w:val="3"/>
         <w:ind w:left="630"/>
       </w:pPr>
-      <w:bookmarkStart w:id="6" w:name="_获取对象（GET_Object）"/>
-      <w:bookmarkEnd w:id="6"/>
+      <w:bookmarkStart w:id="7" w:name="_获取对象（GET_Object）"/>
+      <w:bookmarkEnd w:id="7"/>
       <w:r>
         <w:rPr>
           <w:rFonts w:hint="eastAsia"/>
@@ -25926,9 +26136,6 @@
     <w:p>
       <w:pPr>
         <w:ind w:left="0" w:firstLine="420"/>
-        <w:rPr>
-          <w:rFonts w:hint="eastAsia"/>
-        </w:rPr>
       </w:pPr>
       <w:r>
         <w:rPr>
@@ -26707,8 +26914,8 @@
         <w:pStyle w:val="3"/>
         <w:ind w:left="630"/>
       </w:pPr>
-      <w:bookmarkStart w:id="7" w:name="_删除对象（DELETE_Object）"/>
-      <w:bookmarkEnd w:id="7"/>
+      <w:bookmarkStart w:id="8" w:name="_删除对象（DELETE_Object）"/>
+      <w:bookmarkEnd w:id="8"/>
       <w:r>
         <w:rPr>
           <w:rFonts w:hint="eastAsia"/>
@@ -28336,13 +28543,7 @@
         <w:rPr>
           <w:rFonts w:hint="eastAsia"/>
         </w:rPr>
-        <w:t>对象默认只查询</w:t>
-      </w:r>
-      <w:r>
-        <w:rPr>
-          <w:rFonts w:hint="eastAsia"/>
-        </w:rPr>
-        <w:t>当前最新的对象，如果请求中指定了</w:t>
+        <w:t>对象默认只查询当前最新的对象，如果请求中指定了</w:t>
       </w:r>
       <w:r>
         <w:rPr>
@@ -28458,9 +28659,6 @@
     <w:p>
       <w:pPr>
         <w:ind w:left="0" w:firstLine="420"/>
-        <w:rPr>
-          <w:rFonts w:hint="eastAsia"/>
-        </w:rPr>
       </w:pPr>
       <w:r>
         <w:rPr>
@@ -28578,19 +28776,7 @@
         <w:rPr>
           <w:rFonts w:hint="eastAsia"/>
         </w:rPr>
-        <w:t>两个表</w:t>
-      </w:r>
-      <w:r>
-        <w:rPr>
-          <w:rFonts w:hint="eastAsia"/>
-        </w:rPr>
-        <w:t>中</w:t>
-      </w:r>
-      <w:r>
-        <w:rPr>
-          <w:rFonts w:hint="eastAsia"/>
-        </w:rPr>
-        <w:t>查询是否有</w:t>
+        <w:t>两个表中查询是否有</w:t>
       </w:r>
       <w:r>
         <w:rPr>
@@ -28638,9 +28824,6 @@
     <w:p>
       <w:pPr>
         <w:ind w:left="0" w:firstLineChars="200" w:firstLine="420"/>
-        <w:rPr>
-          <w:rFonts w:hint="eastAsia"/>
-        </w:rPr>
       </w:pPr>
       <w:r>
         <w:rPr>
@@ -28741,13 +28924,7 @@
         <w:rPr>
           <w:rFonts w:hint="eastAsia"/>
         </w:rPr>
-        <w:t>参数，</w:t>
-      </w:r>
-      <w:r>
-        <w:rPr>
-          <w:rFonts w:hint="eastAsia"/>
-        </w:rPr>
-        <w:t>根据</w:t>
+        <w:t>参数，根据</w:t>
       </w:r>
       <w:r>
         <w:rPr>
@@ -28847,10 +29024,10 @@
         </w:rPr>
         <w:lastRenderedPageBreak/>
         <w:drawing>
-          <wp:inline distT="0" distB="0" distL="0" distR="0" wp14:anchorId="37522B17" wp14:editId="413BD532">
-            <wp:extent cx="5274310" cy="9211471"/>
-            <wp:effectExtent l="0" t="0" r="2540" b="8890"/>
-            <wp:docPr id="8" name="图片 8"/>
+          <wp:inline distT="0" distB="0" distL="0" distR="0" wp14:anchorId="718D2898" wp14:editId="53234C56">
+            <wp:extent cx="4981575" cy="9448800"/>
+            <wp:effectExtent l="0" t="0" r="9525" b="0"/>
+            <wp:docPr id="4" name="图片 4"/>
             <wp:cNvGraphicFramePr>
               <a:graphicFrameLocks xmlns:a="http://schemas.openxmlformats.org/drawingml/2006/main" noChangeAspect="1"/>
             </wp:cNvGraphicFramePr>
@@ -28858,7 +29035,7 @@
               <a:graphicData uri="http://schemas.openxmlformats.org/drawingml/2006/picture">
                 <pic:pic xmlns:pic="http://schemas.openxmlformats.org/drawingml/2006/picture">
                   <pic:nvPicPr>
-                    <pic:cNvPr id="0" name="Picture 4"/>
+                    <pic:cNvPr id="0" name="Picture 2"/>
                     <pic:cNvPicPr>
                       <a:picLocks noChangeAspect="1" noChangeArrowheads="1"/>
                     </pic:cNvPicPr>
@@ -28879,7 +29056,7 @@
                   <pic:spPr bwMode="auto">
                     <a:xfrm>
                       <a:off x="0" y="0"/>
-                      <a:ext cx="5274310" cy="9211471"/>
+                      <a:ext cx="4981575" cy="9448800"/>
                     </a:xfrm>
                     <a:prstGeom prst="rect">
                       <a:avLst/>
@@ -28895,8 +29072,6 @@
           </wp:inline>
         </w:drawing>
       </w:r>
-      <w:bookmarkStart w:id="8" w:name="_GoBack"/>
-      <w:bookmarkEnd w:id="8"/>
     </w:p>
     <w:p>
       <w:pPr>
@@ -29770,9 +29945,6 @@
           <w:p>
             <w:pPr>
               <w:ind w:left="0"/>
-              <w:rPr>
-                <w:rFonts w:hint="eastAsia"/>
-              </w:rPr>
             </w:pPr>
             <w:r>
               <w:rPr>
@@ -29789,9 +29961,6 @@
           <w:p>
             <w:pPr>
               <w:ind w:left="0"/>
-              <w:rPr>
-                <w:rFonts w:hint="eastAsia"/>
-              </w:rPr>
             </w:pPr>
             <w:r>
               <w:rPr>
@@ -29915,13 +30084,7 @@
               <w:rPr>
                 <w:rFonts w:hint="eastAsia"/>
               </w:rPr>
-              <w:t>这样的字符</w:t>
-            </w:r>
-            <w:r>
-              <w:rPr>
-                <w:rFonts w:hint="eastAsia"/>
-              </w:rPr>
-              <w:t>，返回</w:t>
+              <w:t>这样的字符，返回</w:t>
             </w:r>
             <w:r>
               <w:rPr>
@@ -29996,9 +30159,6 @@
           <w:p>
             <w:pPr>
               <w:ind w:left="0"/>
-              <w:rPr>
-                <w:rFonts w:hint="eastAsia"/>
-              </w:rPr>
             </w:pPr>
             <w:r>
               <w:rPr>
@@ -37597,10 +37757,13 @@
 
 <file path=word/comments.xml><?xml version="1.0" encoding="utf-8"?>
 <w:comments xmlns:wpc="http://schemas.microsoft.com/office/word/2010/wordprocessingCanvas" xmlns:cx="http://schemas.microsoft.com/office/drawing/2014/chartex" xmlns:mc="http://schemas.openxmlformats.org/markup-compatibility/2006" xmlns:o="urn:schemas-microsoft-com:office:office" xmlns:r="http://schemas.openxmlformats.org/officeDocument/2006/relationships" xmlns:m="http://schemas.openxmlformats.org/officeDocument/2006/math" xmlns:v="urn:schemas-microsoft-com:vml" xmlns:wp14="http://schemas.microsoft.com/office/word/2010/wordprocessingDrawing" xmlns:wp="http://schemas.openxmlformats.org/drawingml/2006/wordprocessingDrawing" xmlns:w10="urn:schemas-microsoft-com:office:word" xmlns:w="http://schemas.openxmlformats.org/wordprocessingml/2006/main" xmlns:w14="http://schemas.microsoft.com/office/word/2010/wordml" xmlns:w15="http://schemas.microsoft.com/office/word/2012/wordml" xmlns:w16se="http://schemas.microsoft.com/office/word/2015/wordml/symex" xmlns:wpg="http://schemas.microsoft.com/office/word/2010/wordprocessingGroup" xmlns:wpi="http://schemas.microsoft.com/office/word/2010/wordprocessingInk" xmlns:wne="http://schemas.microsoft.com/office/word/2006/wordml" xmlns:wps="http://schemas.microsoft.com/office/word/2010/wordprocessingShape" mc:Ignorable="w14 w15 w16se wp14">
-  <w:comment w:id="0" w:author="zhaoyujing" w:date="2018-10-12T10:43:00Z" w:initials="z">
+  <w:comment w:id="0" w:author="zhaoyujing" w:date="2018-11-14T10:12:00Z" w:initials="z">
     <w:p>
       <w:pPr>
         <w:pStyle w:val="af0"/>
+        <w:rPr>
+          <w:rFonts w:hint="eastAsia"/>
+        </w:rPr>
       </w:pPr>
       <w:r>
         <w:rPr>
@@ -37609,16 +37772,13 @@
         <w:annotationRef/>
       </w:r>
       <w:r>
-        <w:rPr>
-          <w:rFonts w:hint="eastAsia"/>
-        </w:rPr>
-        <w:t>查看</w:t>
-      </w:r>
-      <w:r>
-        <w:rPr>
-          <w:rFonts w:hint="eastAsia"/>
-        </w:rPr>
-        <w:t>S3</w:t>
+        <w:t>L</w:t>
+      </w:r>
+      <w:r>
+        <w:rPr>
+          <w:rFonts w:hint="eastAsia"/>
+        </w:rPr>
+        <w:t>ist</w:t>
       </w:r>
       <w:r>
         <w:t xml:space="preserve"> </w:t>
@@ -37627,40 +37787,26 @@
         <w:rPr>
           <w:rFonts w:hint="eastAsia"/>
         </w:rPr>
-        <w:t>的</w:t>
-      </w:r>
-      <w:r>
-        <w:rPr>
-          <w:rFonts w:hint="eastAsia"/>
-        </w:rPr>
-        <w:t>versionId</w:t>
-      </w:r>
-      <w:r>
-        <w:rPr>
-          <w:rFonts w:hint="eastAsia"/>
-        </w:rPr>
-        <w:t>生成规则，与</w:t>
-      </w:r>
-      <w:r>
-        <w:rPr>
-          <w:rFonts w:hint="eastAsia"/>
-        </w:rPr>
-        <w:t>S3</w:t>
-      </w:r>
-      <w:r>
-        <w:rPr>
-          <w:rFonts w:hint="eastAsia"/>
-        </w:rPr>
-        <w:t>保持一致</w:t>
-      </w:r>
-    </w:p>
-    <w:p>
-      <w:pPr>
-        <w:pStyle w:val="af0"/>
-      </w:pPr>
+        <w:t>objects</w:t>
+      </w:r>
+      <w:r>
+        <w:t xml:space="preserve"> </w:t>
+      </w:r>
+      <w:r>
+        <w:rPr>
+          <w:rFonts w:hint="eastAsia"/>
+        </w:rPr>
+        <w:t>v1</w:t>
+      </w:r>
+      <w:r>
+        <w:rPr>
+          <w:rFonts w:hint="eastAsia"/>
+        </w:rPr>
+        <w:t>是否有用户还在使用，是否需要实现</w:t>
+      </w:r>
     </w:p>
   </w:comment>
-  <w:comment w:id="2" w:author="zhaoyujing" w:date="2018-09-21T10:30:00Z" w:initials="z">
+  <w:comment w:id="3" w:author="zhaoyujing" w:date="2018-09-21T10:30:00Z" w:initials="z">
     <w:p>
       <w:pPr>
         <w:pStyle w:val="af0"/>
@@ -37684,7 +37830,7 @@
 
 <file path=word/commentsExtended.xml><?xml version="1.0" encoding="utf-8"?>
 <w15:commentsEx xmlns:wpc="http://schemas.microsoft.com/office/word/2010/wordprocessingCanvas" xmlns:cx="http://schemas.microsoft.com/office/drawing/2014/chartex" xmlns:mc="http://schemas.openxmlformats.org/markup-compatibility/2006" xmlns:o="urn:schemas-microsoft-com:office:office" xmlns:r="http://schemas.openxmlformats.org/officeDocument/2006/relationships" xmlns:m="http://schemas.openxmlformats.org/officeDocument/2006/math" xmlns:v="urn:schemas-microsoft-com:vml" xmlns:wp14="http://schemas.microsoft.com/office/word/2010/wordprocessingDrawing" xmlns:wp="http://schemas.openxmlformats.org/drawingml/2006/wordprocessingDrawing" xmlns:w10="urn:schemas-microsoft-com:office:word" xmlns:w="http://schemas.openxmlformats.org/wordprocessingml/2006/main" xmlns:w14="http://schemas.microsoft.com/office/word/2010/wordml" xmlns:w15="http://schemas.microsoft.com/office/word/2012/wordml" xmlns:w16se="http://schemas.microsoft.com/office/word/2015/wordml/symex" xmlns:wpg="http://schemas.microsoft.com/office/word/2010/wordprocessingGroup" xmlns:wpi="http://schemas.microsoft.com/office/word/2010/wordprocessingInk" xmlns:wne="http://schemas.microsoft.com/office/word/2006/wordml" xmlns:wps="http://schemas.microsoft.com/office/word/2010/wordprocessingShape" mc:Ignorable="w14 w15 w16se wp14">
-  <w15:commentEx w15:paraId="3F40B03E" w15:done="0"/>
+  <w15:commentEx w15:paraId="3D8E43AB" w15:done="0"/>
   <w15:commentEx w15:paraId="713E8501" w15:done="0"/>
 </w15:commentsEx>
 </file>
@@ -37738,7 +37884,7 @@
             <w:noProof/>
             <w:lang w:val="zh-CN"/>
           </w:rPr>
-          <w:t>45</w:t>
+          <w:t>26</w:t>
         </w:r>
         <w:r>
           <w:fldChar w:fldCharType="end"/>
@@ -44292,7 +44438,7 @@
 </file>
 
 <file path=customXml/itemProps1.xml><?xml version="1.0" encoding="utf-8"?>
-<ds:datastoreItem xmlns:ds="http://schemas.openxmlformats.org/officeDocument/2006/customXml" ds:itemID="{D8F3FC26-FF5E-4209-8FB5-BAA48BBBA6AA}">
+<ds:datastoreItem xmlns:ds="http://schemas.openxmlformats.org/officeDocument/2006/customXml" ds:itemID="{F97B8001-BCC8-4F0E-934E-DB71C2BCBC3E}">
   <ds:schemaRefs>
     <ds:schemaRef ds:uri="http://schemas.openxmlformats.org/officeDocument/2006/bibliography"/>
   </ds:schemaRefs>

</xml_diff>

<commit_message>
SEQUOIADBMAINSTREAM-4160 SEQUOIADBMAINSTREAM-3749 【Story】SequoiaDB兼容Amazon S3接口 -支持分隔符可配置 设计文档
git-svn-id: http://192.168.20.11/sequoiadb/trunk@39250 6121f079-4a18-41d3-8c30-8870a322f2c2
</commit_message>
<xml_diff>
--- a/internal_doc/03.开发设计/Amazon S3接口兼容/Story--SequoiaDB兼容Amazon S3接口 -对象管理.docx
+++ b/internal_doc/03.开发设计/Amazon S3接口兼容/Story--SequoiaDB兼容Amazon S3接口 -对象管理.docx
@@ -1247,22 +1247,18 @@
               </w:rPr>
               <w:t>，</w:t>
             </w:r>
-            <w:proofErr w:type="gramStart"/>
             <w:r>
               <w:t>”</w:t>
             </w:r>
-            <w:proofErr w:type="gramEnd"/>
             <w:r>
               <w:rPr>
                 <w:rFonts w:hint="eastAsia"/>
               </w:rPr>
               <w:t>127</w:t>
             </w:r>
-            <w:proofErr w:type="gramStart"/>
             <w:r>
               <w:t>”</w:t>
             </w:r>
-            <w:proofErr w:type="gramEnd"/>
           </w:p>
         </w:tc>
         <w:tc>
@@ -1609,14 +1605,12 @@
               </w:rPr>
               <w:t>/</w:t>
             </w:r>
-            <w:proofErr w:type="gramStart"/>
             <w:r>
               <w:rPr>
                 <w:rFonts w:hint="eastAsia"/>
               </w:rPr>
               <w:t>反勾号</w:t>
             </w:r>
-            <w:proofErr w:type="gramEnd"/>
           </w:p>
         </w:tc>
       </w:tr>
@@ -5428,19 +5422,11 @@
               </w:rPr>
               <w:t>}</w:t>
             </w:r>
-            <w:proofErr w:type="gramStart"/>
             <w:r>
               <w:rPr>
                 <w:i/>
               </w:rPr>
-              <w:t>/?list</w:t>
-            </w:r>
-            <w:proofErr w:type="gramEnd"/>
-            <w:r>
-              <w:rPr>
-                <w:i/>
-              </w:rPr>
-              <w:t xml:space="preserve">-type=2 HTTP/1.1 </w:t>
+              <w:t xml:space="preserve">/?list-type=2 HTTP/1.1 </w:t>
             </w:r>
           </w:p>
           <w:p>
@@ -5704,21 +5690,7 @@
               <w:rPr>
                 <w:i/>
               </w:rPr>
-              <w:t xml:space="preserve">    &lt;ETag&gt;&amp;</w:t>
-            </w:r>
-            <w:proofErr w:type="gramStart"/>
-            <w:r>
-              <w:rPr>
-                <w:i/>
-              </w:rPr>
-              <w:t>quot;fba</w:t>
-            </w:r>
-            <w:proofErr w:type="gramEnd"/>
-            <w:r>
-              <w:rPr>
-                <w:i/>
-              </w:rPr>
-              <w:t xml:space="preserve">9dede5f27731c9771645a39863328&amp;quot;&lt;/ETag&gt;    </w:t>
+              <w:t xml:space="preserve">    &lt;ETag&gt;&amp;quot;fba9dede5f27731c9771645a39863328&amp;quot;&lt;/ETag&gt;    </w:t>
             </w:r>
           </w:p>
           <w:p>
@@ -5889,19 +5861,11 @@
               </w:rPr>
               <w:t>}</w:t>
             </w:r>
-            <w:proofErr w:type="gramStart"/>
             <w:r>
               <w:rPr>
                 <w:i/>
               </w:rPr>
-              <w:t>/?list</w:t>
-            </w:r>
-            <w:proofErr w:type="gramEnd"/>
-            <w:r>
-              <w:rPr>
-                <w:i/>
-              </w:rPr>
-              <w:t xml:space="preserve">-type=2&amp;prefix=photos/2006/&amp;delimiter=/ HTTP/1.1 </w:t>
+              <w:t xml:space="preserve">/?list-type=2&amp;prefix=photos/2006/&amp;delimiter=/ HTTP/1.1 </w:t>
             </w:r>
           </w:p>
           <w:p>
@@ -6153,21 +6117,7 @@
               <w:rPr>
                 <w:i/>
               </w:rPr>
-              <w:t>&lt;ETag&gt;&amp;</w:t>
-            </w:r>
-            <w:proofErr w:type="gramStart"/>
-            <w:r>
-              <w:rPr>
-                <w:i/>
-              </w:rPr>
-              <w:t>quot;d</w:t>
-            </w:r>
-            <w:proofErr w:type="gramEnd"/>
-            <w:r>
-              <w:rPr>
-                <w:i/>
-              </w:rPr>
-              <w:t>41d8cd98f00b204e9800998ecf8427e&amp;quot;&lt;/ETag&gt;</w:t>
+              <w:t>&lt;ETag&gt;&amp;quot;d41d8cd98f00b204e9800998ecf8427e&amp;quot;&lt;/ETag&gt;</w:t>
             </w:r>
           </w:p>
           <w:p>
@@ -8371,16 +8321,11 @@
               </w:rPr>
               <w:t>bucketname</w:t>
             </w:r>
-            <w:proofErr w:type="gramStart"/>
             <w:r>
               <w:t>}</w:t>
             </w:r>
             <w:r>
-              <w:t>?versions</w:t>
-            </w:r>
-            <w:proofErr w:type="gramEnd"/>
-            <w:r>
-              <w:t xml:space="preserve"> HTTP/1.1 </w:t>
+              <w:t xml:space="preserve">?versions HTTP/1.1 </w:t>
             </w:r>
           </w:p>
           <w:p>
@@ -8546,15 +8491,7 @@
               <w:ind w:leftChars="400" w:left="840"/>
             </w:pPr>
             <w:r>
-              <w:t>&lt;LastModified&gt;2009-10-12T17:50:30.000Z&lt;/LastModified&gt;        &lt;ETag&gt;&amp;</w:t>
-            </w:r>
-            <w:proofErr w:type="gramStart"/>
-            <w:r>
-              <w:t>quot;fba</w:t>
-            </w:r>
-            <w:proofErr w:type="gramEnd"/>
-            <w:r>
-              <w:t>9dede5f27731c9771645a39863328&amp;quot;&lt;/ETag&gt;        &lt;Size&gt;434234&lt;/Size&gt;</w:t>
+              <w:t>&lt;LastModified&gt;2009-10-12T17:50:30.000Z&lt;/LastModified&gt;        &lt;ETag&gt;&amp;quot;fba9dede5f27731c9771645a39863328&amp;quot;&lt;/ETag&gt;        &lt;Size&gt;434234&lt;/Size&gt;</w:t>
             </w:r>
           </w:p>
           <w:p>
@@ -9781,13 +9718,8 @@
               </w:rPr>
               <w:t>：</w:t>
             </w:r>
-            <w:proofErr w:type="gramStart"/>
-            <w:r>
-              <w:t>Range:bytes</w:t>
-            </w:r>
-            <w:proofErr w:type="gramEnd"/>
-            <w:r>
-              <w:t>=beginbyte-endbyte</w:t>
+            <w:r>
+              <w:t>Range:bytes=beginbyte-endbyte</w:t>
             </w:r>
           </w:p>
           <w:p>
@@ -9967,15 +9899,7 @@
               <w:ind w:left="0"/>
             </w:pPr>
             <w:r>
-              <w:t xml:space="preserve">Return the object only if its entity </w:t>
-            </w:r>
-            <w:proofErr w:type="gramStart"/>
-            <w:r>
-              <w:t>tag</w:t>
-            </w:r>
-            <w:proofErr w:type="gramEnd"/>
-            <w:r>
-              <w:t xml:space="preserve"> (ETag) is the same as the one speciﬁed; otherwise, return a 412 (precondition failed).</w:t>
+              <w:t>Return the object only if its entity tag (ETag) is the same as the one speciﬁed; otherwise, return a 412 (precondition failed).</w:t>
             </w:r>
           </w:p>
           <w:p>
@@ -10030,15 +9954,7 @@
               <w:ind w:left="0"/>
             </w:pPr>
             <w:r>
-              <w:t xml:space="preserve">Return the object only if its entity </w:t>
-            </w:r>
-            <w:proofErr w:type="gramStart"/>
-            <w:r>
-              <w:t>tag</w:t>
-            </w:r>
-            <w:proofErr w:type="gramEnd"/>
-            <w:r>
-              <w:t xml:space="preserve"> (ETag) is diﬀerent from the one speciﬁed; otherwise, return a 304 (not modiﬁed).</w:t>
+              <w:t>Return the object only if its entity tag (ETag) is diﬀerent from the one speciﬁed; otherwise, return a 304 (not modiﬁed).</w:t>
             </w:r>
           </w:p>
           <w:p>
@@ -12003,13 +11919,8 @@
               </w:rPr>
               <w:t>：</w:t>
             </w:r>
-            <w:proofErr w:type="gramStart"/>
-            <w:r>
-              <w:t>Range:bytes</w:t>
-            </w:r>
-            <w:proofErr w:type="gramEnd"/>
-            <w:r>
-              <w:t>=beginbyte-endbyte</w:t>
+            <w:r>
+              <w:t>Range:bytes=beginbyte-endbyte</w:t>
             </w:r>
           </w:p>
           <w:p>
@@ -12171,15 +12082,7 @@
               <w:ind w:left="0"/>
             </w:pPr>
             <w:r>
-              <w:t xml:space="preserve">Return the object only if its entity </w:t>
-            </w:r>
-            <w:proofErr w:type="gramStart"/>
-            <w:r>
-              <w:t>tag</w:t>
-            </w:r>
-            <w:proofErr w:type="gramEnd"/>
-            <w:r>
-              <w:t xml:space="preserve"> (ETag) is the same as the one speciﬁed; otherwise, return a 412 (precondition failed).</w:t>
+              <w:t>Return the object only if its entity tag (ETag) is the same as the one speciﬁed; otherwise, return a 412 (precondition failed).</w:t>
             </w:r>
           </w:p>
           <w:p>
@@ -12234,15 +12137,7 @@
               <w:ind w:left="0"/>
             </w:pPr>
             <w:r>
-              <w:t xml:space="preserve">Return the object only if its entity </w:t>
-            </w:r>
-            <w:proofErr w:type="gramStart"/>
-            <w:r>
-              <w:t>tag</w:t>
-            </w:r>
-            <w:proofErr w:type="gramEnd"/>
-            <w:r>
-              <w:t xml:space="preserve"> (ETag) is diﬀerent from the one speciﬁed; otherwise, return a 304 (not modiﬁed).</w:t>
+              <w:t>Return the object only if its entity tag (ETag) is diﬀerent from the one speciﬁed; otherwise, return a 304 (not modiﬁed).</w:t>
             </w:r>
           </w:p>
           <w:p>
@@ -13282,16 +13177,8 @@
               <w:rPr>
                 <w:rFonts w:hint="eastAsia"/>
               </w:rPr>
-              <w:t>携带鉴</w:t>
-            </w:r>
-            <w:proofErr w:type="gramStart"/>
-            <w:r>
-              <w:rPr>
-                <w:rFonts w:hint="eastAsia"/>
-              </w:rPr>
-              <w:t>权信息</w:t>
-            </w:r>
-            <w:proofErr w:type="gramEnd"/>
+              <w:t>携带鉴权信息</w:t>
+            </w:r>
           </w:p>
         </w:tc>
       </w:tr>
@@ -13424,28 +13311,15 @@
               <w:ind w:left="0"/>
             </w:pPr>
             <w:r>
-              <w:t xml:space="preserve">ClientConfiguration config = new </w:t>
-            </w:r>
-            <w:proofErr w:type="gramStart"/>
-            <w:r>
-              <w:t>ClientConfiguration(</w:t>
-            </w:r>
-            <w:proofErr w:type="gramEnd"/>
-            <w:r>
-              <w:t>);</w:t>
-            </w:r>
-          </w:p>
-          <w:p>
-            <w:pPr>
-              <w:ind w:left="0"/>
-            </w:pPr>
-            <w:proofErr w:type="gramStart"/>
-            <w:r>
-              <w:t>config.setUseExpectContinue</w:t>
-            </w:r>
-            <w:proofErr w:type="gramEnd"/>
-            <w:r>
-              <w:t>(false);</w:t>
+              <w:t>ClientConfiguration config = new ClientConfiguration();</w:t>
+            </w:r>
+          </w:p>
+          <w:p>
+            <w:pPr>
+              <w:ind w:left="0"/>
+            </w:pPr>
+            <w:r>
+              <w:t>config.setUseExpectContinue(false);</w:t>
             </w:r>
           </w:p>
           <w:p>
@@ -13505,67 +13379,27 @@
           </w:p>
           <w:p>
             <w:r>
-              <w:t xml:space="preserve">        </w:t>
-            </w:r>
-            <w:proofErr w:type="gramStart"/>
-            <w:r>
-              <w:t>.withEndpointConfiguration</w:t>
-            </w:r>
-            <w:proofErr w:type="gramEnd"/>
-            <w:r>
-              <w:t>(endpointConfiguration)</w:t>
-            </w:r>
-          </w:p>
-          <w:p>
-            <w:r>
-              <w:t xml:space="preserve">        </w:t>
-            </w:r>
-            <w:proofErr w:type="gramStart"/>
-            <w:r>
-              <w:t>.withClientConfiguration</w:t>
-            </w:r>
-            <w:proofErr w:type="gramEnd"/>
-            <w:r>
-              <w:t xml:space="preserve">(config)                </w:t>
-            </w:r>
-          </w:p>
-          <w:p>
-            <w:r>
-              <w:t xml:space="preserve">        </w:t>
-            </w:r>
-            <w:proofErr w:type="gramStart"/>
-            <w:r>
-              <w:t>.withCredentials</w:t>
-            </w:r>
-            <w:proofErr w:type="gramEnd"/>
-            <w:r>
-              <w:t xml:space="preserve">(new AWSStaticCredentialsProvider(credentials)) </w:t>
-            </w:r>
-          </w:p>
-          <w:p>
-            <w:r>
-              <w:t xml:space="preserve">        </w:t>
-            </w:r>
-            <w:proofErr w:type="gramStart"/>
-            <w:r>
-              <w:t>.withChunkedEncodingDisabled</w:t>
-            </w:r>
-            <w:proofErr w:type="gramEnd"/>
-            <w:r>
-              <w:t xml:space="preserve">(true)    </w:t>
-            </w:r>
-          </w:p>
-          <w:p>
-            <w:r>
-              <w:t xml:space="preserve">        </w:t>
-            </w:r>
-            <w:proofErr w:type="gramStart"/>
-            <w:r>
-              <w:t>.build</w:t>
-            </w:r>
-            <w:proofErr w:type="gramEnd"/>
-            <w:r>
-              <w:t>()</w:t>
+              <w:t xml:space="preserve">        .withEndpointConfiguration(endpointConfiguration)</w:t>
+            </w:r>
+          </w:p>
+          <w:p>
+            <w:r>
+              <w:t xml:space="preserve">        .withClientConfiguration(config)                </w:t>
+            </w:r>
+          </w:p>
+          <w:p>
+            <w:r>
+              <w:t xml:space="preserve">        .withCredentials(new AWSStaticCredentialsProvider(credentials)) </w:t>
+            </w:r>
+          </w:p>
+          <w:p>
+            <w:r>
+              <w:t xml:space="preserve">        .withChunkedEncodingDisabled(true)    </w:t>
+            </w:r>
+          </w:p>
+          <w:p>
+            <w:r>
+              <w:t xml:space="preserve">        .build()</w:t>
             </w:r>
           </w:p>
           <w:p>
@@ -14125,15 +13959,7 @@
               <w:ind w:left="0"/>
             </w:pPr>
             <w:r>
-              <w:t xml:space="preserve">PutObjectRequest request = new </w:t>
-            </w:r>
-            <w:proofErr w:type="gramStart"/>
-            <w:r>
-              <w:t>PutObjectRequest(</w:t>
-            </w:r>
-            <w:proofErr w:type="gramEnd"/>
-            <w:r>
-              <w:t>bucketname, keyName, new File("C:\\</w:t>
+              <w:t>PutObjectRequest request = new PutObjectRequest(bucketname, keyName, new File("C:\\</w:t>
             </w:r>
             <w:r>
               <w:rPr>
@@ -14159,57 +13985,31 @@
               <w:ind w:left="0"/>
             </w:pPr>
             <w:r>
-              <w:t xml:space="preserve">ObjectMetadata metaData = new </w:t>
-            </w:r>
-            <w:proofErr w:type="gramStart"/>
-            <w:r>
-              <w:t>ObjectMetadata(</w:t>
-            </w:r>
-            <w:proofErr w:type="gramEnd"/>
-            <w:r>
-              <w:t>);</w:t>
-            </w:r>
-          </w:p>
-          <w:p>
-            <w:pPr>
-              <w:ind w:left="0"/>
-            </w:pPr>
-            <w:r>
-              <w:t>Map&lt;</w:t>
-            </w:r>
-            <w:proofErr w:type="gramStart"/>
-            <w:r>
-              <w:t>String,String</w:t>
-            </w:r>
-            <w:proofErr w:type="gramEnd"/>
-            <w:r>
-              <w:t>&gt; xMeta = new HashMap&lt;String, String&gt;();</w:t>
-            </w:r>
-          </w:p>
-          <w:p>
-            <w:pPr>
-              <w:ind w:left="0"/>
-            </w:pPr>
-            <w:proofErr w:type="gramStart"/>
-            <w:r>
-              <w:t>xMeta.put(</w:t>
-            </w:r>
-            <w:proofErr w:type="gramEnd"/>
-            <w:r>
-              <w:t>"test1", "1234");</w:t>
-            </w:r>
-          </w:p>
-          <w:p>
-            <w:pPr>
-              <w:ind w:left="0"/>
-            </w:pPr>
-            <w:proofErr w:type="gramStart"/>
-            <w:r>
-              <w:t>xMeta.put(</w:t>
-            </w:r>
-            <w:proofErr w:type="gramEnd"/>
-            <w:r>
-              <w:t>"test2", "123343");</w:t>
+              <w:t>ObjectMetadata metaData = new ObjectMetadata();</w:t>
+            </w:r>
+          </w:p>
+          <w:p>
+            <w:pPr>
+              <w:ind w:left="0"/>
+            </w:pPr>
+            <w:r>
+              <w:t>Map&lt;String,String&gt; xMeta = new HashMap&lt;String, String&gt;();</w:t>
+            </w:r>
+          </w:p>
+          <w:p>
+            <w:pPr>
+              <w:ind w:left="0"/>
+            </w:pPr>
+            <w:r>
+              <w:t>xMeta.put("test1", "1234");</w:t>
+            </w:r>
+          </w:p>
+          <w:p>
+            <w:pPr>
+              <w:ind w:left="0"/>
+            </w:pPr>
+            <w:r>
+              <w:t>xMeta.put("test2", "123343");</w:t>
             </w:r>
           </w:p>
           <w:p>
@@ -14257,15 +14057,7 @@
               <w:ind w:left="0"/>
             </w:pPr>
             <w:r>
-              <w:t xml:space="preserve">metaData.setExpirationTime(new </w:t>
-            </w:r>
-            <w:proofErr w:type="gramStart"/>
-            <w:r>
-              <w:t>Date(</w:t>
-            </w:r>
-            <w:proofErr w:type="gramEnd"/>
-            <w:r>
-              <w:t>));</w:t>
+              <w:t>metaData.setExpirationTime(new Date());</w:t>
             </w:r>
           </w:p>
           <w:p>
@@ -14280,13 +14072,8 @@
             <w:pPr>
               <w:ind w:left="0"/>
             </w:pPr>
-            <w:proofErr w:type="gramStart"/>
-            <w:r>
-              <w:t>request.withMetadata</w:t>
-            </w:r>
-            <w:proofErr w:type="gramEnd"/>
-            <w:r>
-              <w:t>(metaData);</w:t>
+            <w:r>
+              <w:t>request.withMetadata(metaData);</w:t>
             </w:r>
           </w:p>
           <w:p>
@@ -14627,16 +14414,8 @@
               <w:rPr>
                 <w:rFonts w:hint="eastAsia"/>
               </w:rPr>
-              <w:t>请求中</w:t>
-            </w:r>
-            <w:proofErr w:type="gramStart"/>
-            <w:r>
-              <w:rPr>
-                <w:rFonts w:hint="eastAsia"/>
-              </w:rPr>
-              <w:t>添加桶名</w:t>
-            </w:r>
-            <w:proofErr w:type="gramEnd"/>
+              <w:t>请求中添加桶名</w:t>
+            </w:r>
           </w:p>
         </w:tc>
       </w:tr>
@@ -15130,93 +14909,55 @@
               <w:ind w:left="0" w:firstLineChars="300" w:firstLine="630"/>
             </w:pPr>
             <w:r>
-              <w:t xml:space="preserve"> new ListObjectsV2Request(</w:t>
-            </w:r>
-            <w:proofErr w:type="gramStart"/>
-            <w:r>
-              <w:t>).withBucketName</w:t>
-            </w:r>
-            <w:proofErr w:type="gramEnd"/>
-            <w:r>
-              <w:t>(bucket).withEncodingType("url");</w:t>
-            </w:r>
-          </w:p>
-          <w:p>
-            <w:pPr>
-              <w:ind w:left="0"/>
-            </w:pPr>
-            <w:proofErr w:type="gramStart"/>
-            <w:r>
-              <w:t>request.withMaxKeys</w:t>
-            </w:r>
-            <w:proofErr w:type="gramEnd"/>
-            <w:r>
-              <w:t>(1);</w:t>
-            </w:r>
-          </w:p>
-          <w:p>
-            <w:pPr>
-              <w:ind w:left="0"/>
-            </w:pPr>
-            <w:proofErr w:type="gramStart"/>
-            <w:r>
-              <w:t>request.withPrefix</w:t>
-            </w:r>
-            <w:proofErr w:type="gramEnd"/>
-            <w:r>
-              <w:t>("aa/bb/");</w:t>
-            </w:r>
-          </w:p>
-          <w:p>
-            <w:pPr>
-              <w:ind w:left="0"/>
-            </w:pPr>
-            <w:proofErr w:type="gramStart"/>
-            <w:r>
-              <w:t>request.withDelimiter</w:t>
-            </w:r>
-            <w:proofErr w:type="gramEnd"/>
-            <w:r>
-              <w:t>("/");</w:t>
-            </w:r>
-          </w:p>
-          <w:p>
-            <w:pPr>
-              <w:ind w:left="0"/>
-            </w:pPr>
-            <w:proofErr w:type="gramStart"/>
-            <w:r>
-              <w:t>request.withFetchOwner</w:t>
-            </w:r>
-            <w:proofErr w:type="gramEnd"/>
-            <w:r>
-              <w:t>(true);</w:t>
-            </w:r>
-          </w:p>
-          <w:p>
-            <w:pPr>
-              <w:ind w:left="0"/>
-            </w:pPr>
-            <w:proofErr w:type="gramStart"/>
-            <w:r>
-              <w:t>request.withStartAfter</w:t>
-            </w:r>
-            <w:proofErr w:type="gramEnd"/>
-            <w:r>
-              <w:t>("aa");</w:t>
-            </w:r>
-          </w:p>
-          <w:p>
-            <w:pPr>
-              <w:ind w:left="0"/>
-            </w:pPr>
-            <w:proofErr w:type="gramStart"/>
-            <w:r>
-              <w:t>request.withContinuationToken</w:t>
-            </w:r>
-            <w:proofErr w:type="gramEnd"/>
-            <w:r>
-              <w:t>("B1AND1I");</w:t>
+              <w:t xml:space="preserve"> new ListObjectsV2Request().withBucketName(bucket).withEncodingType("url");</w:t>
+            </w:r>
+          </w:p>
+          <w:p>
+            <w:pPr>
+              <w:ind w:left="0"/>
+            </w:pPr>
+            <w:r>
+              <w:t>request.withMaxKeys(1);</w:t>
+            </w:r>
+          </w:p>
+          <w:p>
+            <w:pPr>
+              <w:ind w:left="0"/>
+            </w:pPr>
+            <w:r>
+              <w:t>request.withPrefix("aa/bb/");</w:t>
+            </w:r>
+          </w:p>
+          <w:p>
+            <w:pPr>
+              <w:ind w:left="0"/>
+            </w:pPr>
+            <w:r>
+              <w:t>request.withDelimiter("/");</w:t>
+            </w:r>
+          </w:p>
+          <w:p>
+            <w:pPr>
+              <w:ind w:left="0"/>
+            </w:pPr>
+            <w:r>
+              <w:t>request.withFetchOwner(true);</w:t>
+            </w:r>
+          </w:p>
+          <w:p>
+            <w:pPr>
+              <w:ind w:left="0"/>
+            </w:pPr>
+            <w:r>
+              <w:t>request.withStartAfter("aa");</w:t>
+            </w:r>
+          </w:p>
+          <w:p>
+            <w:pPr>
+              <w:ind w:left="0"/>
+            </w:pPr>
+            <w:r>
+              <w:t>request.withContinuationToken("B1AND1I");</w:t>
             </w:r>
           </w:p>
           <w:p>
@@ -15646,74 +15387,45 @@
               <w:ind w:left="0"/>
             </w:pPr>
             <w:r>
-              <w:t xml:space="preserve">ListVersionsRequest request = new </w:t>
-            </w:r>
-            <w:proofErr w:type="gramStart"/>
-            <w:r>
-              <w:t>ListVersionsRequest(</w:t>
-            </w:r>
-            <w:proofErr w:type="gramEnd"/>
-            <w:r>
-              <w:t>);</w:t>
-            </w:r>
-          </w:p>
-          <w:p>
-            <w:pPr>
-              <w:ind w:left="0"/>
-            </w:pPr>
-            <w:proofErr w:type="gramStart"/>
-            <w:r>
-              <w:t>request.setBucketName</w:t>
-            </w:r>
-            <w:proofErr w:type="gramEnd"/>
-            <w:r>
-              <w:t>(bucket);</w:t>
-            </w:r>
-          </w:p>
-          <w:p>
-            <w:pPr>
-              <w:ind w:left="0"/>
-            </w:pPr>
-            <w:proofErr w:type="gramStart"/>
-            <w:r>
-              <w:t>request.setDelimiter</w:t>
-            </w:r>
-            <w:proofErr w:type="gramEnd"/>
-            <w:r>
-              <w:t>("/");</w:t>
-            </w:r>
-          </w:p>
-          <w:p>
-            <w:pPr>
-              <w:ind w:left="0"/>
-            </w:pPr>
-            <w:proofErr w:type="gramStart"/>
-            <w:r>
-              <w:t>request.setEncodingType</w:t>
-            </w:r>
-            <w:proofErr w:type="gramEnd"/>
-            <w:r>
-              <w:t>("url");</w:t>
-            </w:r>
-          </w:p>
-          <w:p>
-            <w:pPr>
-              <w:ind w:left="0"/>
-            </w:pPr>
-            <w:proofErr w:type="gramStart"/>
-            <w:r>
-              <w:t>equest.setKeyMarker</w:t>
-            </w:r>
-            <w:proofErr w:type="gramEnd"/>
-            <w:r>
-              <w:t>("aa");</w:t>
-            </w:r>
-          </w:p>
-          <w:p>
-            <w:pPr>
-              <w:ind w:left="0"/>
-            </w:pPr>
-            <w:proofErr w:type="gramStart"/>
+              <w:t>ListVersionsRequest request = new ListVersionsRequest();</w:t>
+            </w:r>
+          </w:p>
+          <w:p>
+            <w:pPr>
+              <w:ind w:left="0"/>
+            </w:pPr>
+            <w:r>
+              <w:t>request.setBucketName(bucket);</w:t>
+            </w:r>
+          </w:p>
+          <w:p>
+            <w:pPr>
+              <w:ind w:left="0"/>
+            </w:pPr>
+            <w:r>
+              <w:t>request.setDelimiter("/");</w:t>
+            </w:r>
+          </w:p>
+          <w:p>
+            <w:pPr>
+              <w:ind w:left="0"/>
+            </w:pPr>
+            <w:r>
+              <w:t>request.setEncodingType("url");</w:t>
+            </w:r>
+          </w:p>
+          <w:p>
+            <w:pPr>
+              <w:ind w:left="0"/>
+            </w:pPr>
+            <w:r>
+              <w:t>equest.setKeyMarker("aa");</w:t>
+            </w:r>
+          </w:p>
+          <w:p>
+            <w:pPr>
+              <w:ind w:left="0"/>
+            </w:pPr>
             <w:r>
               <w:rPr>
                 <w:rFonts w:hint="eastAsia"/>
@@ -15721,18 +15433,13 @@
               <w:t>r</w:t>
             </w:r>
             <w:r>
-              <w:t>equest.setMaxResults</w:t>
-            </w:r>
-            <w:proofErr w:type="gramEnd"/>
-            <w:r>
-              <w:t>(1000);</w:t>
-            </w:r>
-          </w:p>
-          <w:p>
-            <w:pPr>
-              <w:ind w:left="0"/>
-            </w:pPr>
-            <w:proofErr w:type="gramStart"/>
+              <w:t>equest.setMaxResults(1000);</w:t>
+            </w:r>
+          </w:p>
+          <w:p>
+            <w:pPr>
+              <w:ind w:left="0"/>
+            </w:pPr>
             <w:r>
               <w:rPr>
                 <w:rFonts w:hint="eastAsia"/>
@@ -15740,24 +15447,15 @@
               <w:t>r</w:t>
             </w:r>
             <w:r>
-              <w:t>equest.setPrefix</w:t>
-            </w:r>
-            <w:proofErr w:type="gramEnd"/>
-            <w:r>
-              <w:t>("aa");</w:t>
-            </w:r>
-          </w:p>
-          <w:p>
-            <w:pPr>
-              <w:ind w:left="0"/>
-            </w:pPr>
-            <w:proofErr w:type="gramStart"/>
-            <w:r>
-              <w:t>request.setVersionIdMarker</w:t>
-            </w:r>
-            <w:proofErr w:type="gramEnd"/>
-            <w:r>
-              <w:t>("null");</w:t>
+              <w:t>equest.setPrefix("aa");</w:t>
+            </w:r>
+          </w:p>
+          <w:p>
+            <w:pPr>
+              <w:ind w:left="0"/>
+            </w:pPr>
+            <w:r>
+              <w:t>request.setVersionIdMarker("null");</w:t>
             </w:r>
           </w:p>
           <w:p>
@@ -17083,70 +16781,39 @@
               <w:ind w:left="0"/>
             </w:pPr>
             <w:r>
-              <w:t xml:space="preserve">GetObjectRequest request = new </w:t>
-            </w:r>
-            <w:proofErr w:type="gramStart"/>
-            <w:r>
-              <w:t>GetObjectRequest(</w:t>
-            </w:r>
-            <w:proofErr w:type="gramEnd"/>
-            <w:r>
-              <w:t>bucketName, keyName);</w:t>
-            </w:r>
-          </w:p>
-          <w:p>
-            <w:pPr>
-              <w:ind w:left="0"/>
-            </w:pPr>
-            <w:proofErr w:type="gramStart"/>
-            <w:r>
-              <w:t>request.withMatchingETagConstraint</w:t>
-            </w:r>
-            <w:proofErr w:type="gramEnd"/>
-            <w:r>
-              <w:t>("cd6539df5298799314cd096b819bfcc8");</w:t>
-            </w:r>
-          </w:p>
-          <w:p>
-            <w:pPr>
-              <w:ind w:left="0"/>
-            </w:pPr>
-            <w:proofErr w:type="gramStart"/>
-            <w:r>
-              <w:t>request.withModifiedSinceConstraint</w:t>
-            </w:r>
-            <w:proofErr w:type="gramEnd"/>
-            <w:r>
-              <w:t>(new Date("Wed, 19 Sep 2018 01:30:01 GMT"));</w:t>
-            </w:r>
-          </w:p>
-          <w:p>
-            <w:pPr>
-              <w:ind w:left="0"/>
-            </w:pPr>
-            <w:proofErr w:type="gramStart"/>
-            <w:r>
-              <w:t>request.withRange</w:t>
-            </w:r>
-            <w:proofErr w:type="gramEnd"/>
-            <w:r>
-              <w:t>(-7938);</w:t>
-            </w:r>
-          </w:p>
-          <w:p>
-            <w:pPr>
-              <w:ind w:left="0"/>
-            </w:pPr>
-            <w:r>
-              <w:t xml:space="preserve">ResponseHeaderOverrides overrideHeaders = new </w:t>
-            </w:r>
-            <w:proofErr w:type="gramStart"/>
-            <w:r>
-              <w:t>ResponseHeaderOverrides(</w:t>
-            </w:r>
-            <w:proofErr w:type="gramEnd"/>
-            <w:r>
-              <w:t>);</w:t>
+              <w:t>GetObjectRequest request = new GetObjectRequest(bucketName, keyName);</w:t>
+            </w:r>
+          </w:p>
+          <w:p>
+            <w:pPr>
+              <w:ind w:left="0"/>
+            </w:pPr>
+            <w:r>
+              <w:t>request.withMatchingETagConstraint("cd6539df5298799314cd096b819bfcc8");</w:t>
+            </w:r>
+          </w:p>
+          <w:p>
+            <w:pPr>
+              <w:ind w:left="0"/>
+            </w:pPr>
+            <w:r>
+              <w:t>request.withModifiedSinceConstraint(new Date("Wed, 19 Sep 2018 01:30:01 GMT"));</w:t>
+            </w:r>
+          </w:p>
+          <w:p>
+            <w:pPr>
+              <w:ind w:left="0"/>
+            </w:pPr>
+            <w:r>
+              <w:t>request.withRange(-7938);</w:t>
+            </w:r>
+          </w:p>
+          <w:p>
+            <w:pPr>
+              <w:ind w:left="0"/>
+            </w:pPr>
+            <w:r>
+              <w:t>ResponseHeaderOverrides overrideHeaders = new ResponseHeaderOverrides();</w:t>
             </w:r>
           </w:p>
           <w:p>
@@ -17169,13 +16836,8 @@
             <w:pPr>
               <w:ind w:left="0"/>
             </w:pPr>
-            <w:proofErr w:type="gramStart"/>
-            <w:r>
-              <w:t>request.withResponseHeaders</w:t>
-            </w:r>
-            <w:proofErr w:type="gramEnd"/>
-            <w:r>
-              <w:t>(overrideHeaders);</w:t>
+            <w:r>
+              <w:t>request.withResponseHeaders(overrideHeaders);</w:t>
             </w:r>
           </w:p>
           <w:p>
@@ -17467,15 +17129,7 @@
               <w:ind w:left="0"/>
             </w:pPr>
             <w:r>
-              <w:t>amazonS3.deleteObject(</w:t>
-            </w:r>
-            <w:proofErr w:type="gramStart"/>
-            <w:r>
-              <w:t>bucket,key</w:t>
-            </w:r>
-            <w:proofErr w:type="gramEnd"/>
-            <w:r>
-              <w:t>);</w:t>
+              <w:t>amazonS3.deleteObject(bucket,key);</w:t>
             </w:r>
           </w:p>
           <w:p>
@@ -18010,15 +17664,7 @@
               <w:ind w:left="0" w:firstLineChars="1000" w:firstLine="2100"/>
             </w:pPr>
             <w:r>
-              <w:t xml:space="preserve">new </w:t>
-            </w:r>
-            <w:proofErr w:type="gramStart"/>
-            <w:r>
-              <w:t>GetObjectMetadataRequest(</w:t>
-            </w:r>
-            <w:proofErr w:type="gramEnd"/>
-            <w:r>
-              <w:t>bucket, object, versionId);</w:t>
+              <w:t>new GetObjectMetadataRequest(bucket, object, versionId);</w:t>
             </w:r>
           </w:p>
           <w:p>
@@ -18274,23 +17920,7 @@
           <w:rFonts w:hint="eastAsia"/>
           <w:color w:val="00B0F0"/>
         </w:rPr>
-        <w:t>使用时序</w:t>
-      </w:r>
-      <w:proofErr w:type="gramStart"/>
-      <w:r>
-        <w:rPr>
-          <w:rFonts w:hint="eastAsia"/>
-          <w:color w:val="00B0F0"/>
-        </w:rPr>
-        <w:t>图或者</w:t>
-      </w:r>
-      <w:proofErr w:type="gramEnd"/>
-      <w:r>
-        <w:rPr>
-          <w:rFonts w:hint="eastAsia"/>
-          <w:color w:val="00B0F0"/>
-        </w:rPr>
-        <w:t>活动图</w:t>
+        <w:t>使用时序图或者活动图</w:t>
       </w:r>
       <w:r>
         <w:rPr>
@@ -19360,21 +18990,7 @@
         <w:rPr>
           <w:rFonts w:hint="eastAsia"/>
         </w:rPr>
-        <w:t>补充鉴</w:t>
-      </w:r>
-      <w:proofErr w:type="gramStart"/>
-      <w:r>
-        <w:rPr>
-          <w:rFonts w:hint="eastAsia"/>
-        </w:rPr>
-        <w:t>权功能时时再</w:t>
-      </w:r>
-      <w:proofErr w:type="gramEnd"/>
-      <w:r>
-        <w:rPr>
-          <w:rFonts w:hint="eastAsia"/>
-        </w:rPr>
-        <w:t>补充此段检查。</w:t>
+        <w:t>补充鉴权功能时时再补充此段检查。</w:t>
       </w:r>
     </w:p>
     <w:p>
@@ -20714,7 +20330,6 @@
           <w:szCs w:val="30"/>
         </w:rPr>
       </w:pPr>
-      <w:proofErr w:type="gramStart"/>
       <w:r>
         <w:rPr>
           <w:rFonts w:hint="eastAsia"/>
@@ -20722,9 +20337,299 @@
           <w:sz w:val="30"/>
           <w:szCs w:val="30"/>
         </w:rPr>
-        <w:t>sdbs3.sequoiadb.meta</w:t>
-      </w:r>
-      <w:proofErr w:type="gramEnd"/>
+        <w:t>sdbs3.sequoiadb.meta.csName</w:t>
+      </w:r>
+      <w:r>
+        <w:rPr>
+          <w:rFonts w:hint="eastAsia"/>
+          <w:color w:val="808080"/>
+          <w:sz w:val="30"/>
+          <w:szCs w:val="30"/>
+        </w:rPr>
+        <w:t>=</w:t>
+      </w:r>
+      <w:r>
+        <w:rPr>
+          <w:rFonts w:hint="eastAsia"/>
+          <w:color w:val="6A8759"/>
+          <w:sz w:val="30"/>
+          <w:szCs w:val="30"/>
+        </w:rPr>
+        <w:t>S3_SYS_Meta</w:t>
+      </w:r>
+    </w:p>
+    <w:p>
+      <w:pPr>
+        <w:spacing w:beforeLines="50" w:before="156" w:afterLines="50" w:after="156"/>
+        <w:ind w:left="0" w:firstLineChars="200" w:firstLine="420"/>
+      </w:pPr>
+      <w:r>
+        <w:rPr>
+          <w:rFonts w:hint="eastAsia"/>
+        </w:rPr>
+        <w:t>如果创建桶时指定了区域信息，则创建元数据集合空间为</w:t>
+      </w:r>
+      <w:r>
+        <w:t>”</w:t>
+      </w:r>
+      <w:r>
+        <w:rPr>
+          <w:rFonts w:hint="eastAsia"/>
+        </w:rPr>
+        <w:t>S3_</w:t>
+      </w:r>
+      <w:r>
+        <w:t>”+</w:t>
+      </w:r>
+      <w:r>
+        <w:rPr>
+          <w:rFonts w:hint="eastAsia"/>
+        </w:rPr>
+        <w:t>region</w:t>
+      </w:r>
+      <w:r>
+        <w:t>+”</w:t>
+      </w:r>
+      <w:r>
+        <w:t xml:space="preserve"> _MetaCS</w:t>
+      </w:r>
+      <w:r>
+        <w:t>”</w:t>
+      </w:r>
+      <w:r>
+        <w:rPr>
+          <w:rFonts w:hint="eastAsia"/>
+        </w:rPr>
+        <w:t>，如果区域配置中指定了</w:t>
+      </w:r>
+      <w:r>
+        <w:rPr>
+          <w:rFonts w:hint="eastAsia"/>
+        </w:rPr>
+        <w:t>MetaDomain</w:t>
+      </w:r>
+      <w:r>
+        <w:rPr>
+          <w:rFonts w:hint="eastAsia"/>
+        </w:rPr>
+        <w:t>，则该集合空间建立在</w:t>
+      </w:r>
+      <w:r>
+        <w:rPr>
+          <w:rFonts w:hint="eastAsia"/>
+        </w:rPr>
+        <w:t>MetaDomain</w:t>
+      </w:r>
+      <w:r>
+        <w:rPr>
+          <w:rFonts w:hint="eastAsia"/>
+        </w:rPr>
+        <w:t>指定的域上。</w:t>
+      </w:r>
+    </w:p>
+    <w:p>
+      <w:pPr>
+        <w:spacing w:beforeLines="50" w:before="156" w:afterLines="50" w:after="156"/>
+        <w:ind w:left="0" w:firstLineChars="200" w:firstLine="420"/>
+      </w:pPr>
+      <w:r>
+        <w:rPr>
+          <w:rFonts w:hint="eastAsia"/>
+        </w:rPr>
+        <w:lastRenderedPageBreak/>
+        <w:t>元数据集合空间下的最新元数据集合名为</w:t>
+      </w:r>
+      <w:r>
+        <w:t>S3_ObjectMeta</w:t>
+      </w:r>
+      <w:r>
+        <w:rPr>
+          <w:rFonts w:hint="eastAsia"/>
+        </w:rPr>
+        <w:t>，历史元数据集合为</w:t>
+      </w:r>
+      <w:r>
+        <w:t>S3_ObjectMetaHistory</w:t>
+      </w:r>
+      <w:r>
+        <w:rPr>
+          <w:rFonts w:hint="eastAsia"/>
+        </w:rPr>
+        <w:t>，如果当前集合空间下不存在该集合，则创建集合。</w:t>
+      </w:r>
+    </w:p>
+    <w:p>
+      <w:pPr>
+        <w:spacing w:beforeLines="50" w:before="156" w:afterLines="50" w:after="156"/>
+        <w:ind w:left="0" w:firstLineChars="200" w:firstLine="420"/>
+      </w:pPr>
+      <w:r>
+        <w:rPr>
+          <w:rFonts w:hint="eastAsia"/>
+        </w:rPr>
+        <w:t>写入对象数据时</w:t>
+      </w:r>
+      <w:r>
+        <w:rPr>
+          <w:rFonts w:hint="eastAsia"/>
+        </w:rPr>
+        <w:t>会生成元数据的集合空间名称和集合名称，还会生成对象数据的集合空间和集合名称，将对象数据写入生成的</w:t>
+      </w:r>
+      <w:r>
+        <w:rPr>
+          <w:rFonts w:hint="eastAsia"/>
+        </w:rPr>
+        <w:t>对象数据集合</w:t>
+      </w:r>
+      <w:r>
+        <w:rPr>
+          <w:rFonts w:hint="eastAsia"/>
+        </w:rPr>
+        <w:t>，获取</w:t>
+      </w:r>
+      <w:r>
+        <w:rPr>
+          <w:rFonts w:hint="eastAsia"/>
+        </w:rPr>
+        <w:t>LobId</w:t>
+      </w:r>
+      <w:r>
+        <w:rPr>
+          <w:rFonts w:hint="eastAsia"/>
+        </w:rPr>
+        <w:t>，将对象数据</w:t>
+      </w:r>
+      <w:r>
+        <w:rPr>
+          <w:rFonts w:hint="eastAsia"/>
+        </w:rPr>
+        <w:t>集合空间，</w:t>
+      </w:r>
+      <w:r>
+        <w:rPr>
+          <w:rFonts w:hint="eastAsia"/>
+        </w:rPr>
+        <w:t>集合名称和</w:t>
+      </w:r>
+      <w:r>
+        <w:rPr>
+          <w:rFonts w:hint="eastAsia"/>
+        </w:rPr>
+        <w:t>LobId</w:t>
+      </w:r>
+      <w:r>
+        <w:rPr>
+          <w:rFonts w:hint="eastAsia"/>
+        </w:rPr>
+        <w:t>记录写入</w:t>
+      </w:r>
+      <w:r>
+        <w:rPr>
+          <w:rFonts w:hint="eastAsia"/>
+        </w:rPr>
+        <w:t>生成的</w:t>
+      </w:r>
+      <w:r>
+        <w:rPr>
+          <w:rFonts w:hint="eastAsia"/>
+        </w:rPr>
+        <w:t>元数据</w:t>
+      </w:r>
+      <w:r>
+        <w:rPr>
+          <w:rFonts w:hint="eastAsia"/>
+        </w:rPr>
+        <w:t>集合</w:t>
+      </w:r>
+      <w:r>
+        <w:rPr>
+          <w:rFonts w:hint="eastAsia"/>
+        </w:rPr>
+        <w:t>。</w:t>
+      </w:r>
+      <w:r>
+        <w:rPr>
+          <w:rFonts w:hint="eastAsia"/>
+        </w:rPr>
+        <w:t>当写入时报</w:t>
+      </w:r>
+      <w:r>
+        <w:rPr>
+          <w:rFonts w:hint="eastAsia"/>
+        </w:rPr>
+        <w:t>CS</w:t>
+      </w:r>
+      <w:r>
+        <w:rPr>
+          <w:rFonts w:hint="eastAsia"/>
+        </w:rPr>
+        <w:t>或</w:t>
+      </w:r>
+      <w:r>
+        <w:rPr>
+          <w:rFonts w:hint="eastAsia"/>
+        </w:rPr>
+        <w:t>CL</w:t>
+      </w:r>
+      <w:r>
+        <w:rPr>
+          <w:rFonts w:hint="eastAsia"/>
+        </w:rPr>
+        <w:t>不存在则创建相应的</w:t>
+      </w:r>
+      <w:r>
+        <w:rPr>
+          <w:rFonts w:hint="eastAsia"/>
+        </w:rPr>
+        <w:t>CS</w:t>
+      </w:r>
+      <w:r>
+        <w:rPr>
+          <w:rFonts w:hint="eastAsia"/>
+        </w:rPr>
+        <w:t>和</w:t>
+      </w:r>
+      <w:r>
+        <w:rPr>
+          <w:rFonts w:hint="eastAsia"/>
+        </w:rPr>
+        <w:t>CL</w:t>
+      </w:r>
+      <w:r>
+        <w:rPr>
+          <w:rFonts w:hint="eastAsia"/>
+        </w:rPr>
+        <w:t>。</w:t>
+      </w:r>
+      <w:r>
+        <w:rPr>
+          <w:rFonts w:hint="eastAsia"/>
+        </w:rPr>
+        <w:t xml:space="preserve">    </w:t>
+      </w:r>
+    </w:p>
+    <w:p>
+      <w:pPr>
+        <w:spacing w:beforeLines="50" w:before="156" w:afterLines="50" w:after="156"/>
+        <w:ind w:left="0" w:firstLineChars="200" w:firstLine="420"/>
+      </w:pPr>
+      <w:r>
+        <w:rPr>
+          <w:rFonts w:hint="eastAsia"/>
+        </w:rPr>
+        <w:t>如果配置文件中记录的对象数据集合空间如下，如果创建桶时不指定区域信息，则对象数据存储在该集合空间下。</w:t>
+      </w:r>
+    </w:p>
+    <w:p>
+      <w:pPr>
+        <w:pStyle w:val="HTML"/>
+        <w:shd w:val="clear" w:color="auto" w:fill="2B2B2B"/>
+        <w:rPr>
+          <w:color w:val="A9B7C6"/>
+          <w:sz w:val="30"/>
+          <w:szCs w:val="30"/>
+        </w:rPr>
+      </w:pPr>
       <w:r>
         <w:rPr>
           <w:rFonts w:hint="eastAsia"/>
@@ -20732,7 +20637,7 @@
           <w:sz w:val="30"/>
           <w:szCs w:val="30"/>
         </w:rPr>
-        <w:t>.csName</w:t>
+        <w:t>sdbs3.sequoiadb.data.csName</w:t>
       </w:r>
       <w:r>
         <w:rPr>
@@ -20745,12 +20650,11 @@
       </w:r>
       <w:r>
         <w:rPr>
-          <w:rFonts w:hint="eastAsia"/>
           <w:color w:val="6A8759"/>
           <w:sz w:val="30"/>
           <w:szCs w:val="30"/>
         </w:rPr>
-        <w:t>S3_SYS_Meta</w:t>
+        <w:t>S3_SYS_Data</w:t>
       </w:r>
     </w:p>
     <w:p>
@@ -20762,78 +20666,193 @@
         <w:rPr>
           <w:rFonts w:hint="eastAsia"/>
         </w:rPr>
-        <w:t>如果创建桶时指定了区域信息，则创建元数据集合空间为</w:t>
-      </w:r>
-      <w:proofErr w:type="gramStart"/>
+        <w:t>如果创建桶时指定了区域信息，</w:t>
+      </w:r>
+      <w:r>
+        <w:rPr>
+          <w:rFonts w:hint="eastAsia"/>
+        </w:rPr>
+        <w:t>并且区域值为</w:t>
+      </w:r>
+      <w:r>
+        <w:rPr>
+          <w:rFonts w:hint="eastAsia"/>
+        </w:rPr>
+        <w:t>ShardingType</w:t>
+      </w:r>
+      <w:r>
+        <w:rPr>
+          <w:rFonts w:hint="eastAsia"/>
+        </w:rPr>
+        <w:t>模式，</w:t>
+      </w:r>
+      <w:r>
+        <w:rPr>
+          <w:rFonts w:hint="eastAsia"/>
+        </w:rPr>
+        <w:t>则创建</w:t>
+      </w:r>
+      <w:r>
+        <w:rPr>
+          <w:rFonts w:hint="eastAsia"/>
+        </w:rPr>
+        <w:t>数据集合空间为</w:t>
+      </w:r>
+      <w:r>
+        <w:t>”S3</w:t>
+      </w:r>
+      <w:r>
+        <w:rPr>
+          <w:rFonts w:hint="eastAsia"/>
+        </w:rPr>
+        <w:t>_</w:t>
+      </w:r>
+      <w:r>
+        <w:t>”+</w:t>
+      </w:r>
+      <w:r>
+        <w:rPr>
+          <w:rFonts w:hint="eastAsia"/>
+        </w:rPr>
+        <w:t>region</w:t>
+      </w:r>
+      <w:r>
+        <w:t>+”</w:t>
+      </w:r>
+      <w:r>
+        <w:t xml:space="preserve"> </w:t>
+      </w:r>
+      <w:r>
+        <w:t>_</w:t>
+      </w:r>
+      <w:r>
+        <w:rPr>
+          <w:rFonts w:hint="eastAsia"/>
+        </w:rPr>
+        <w:t>Da</w:t>
+      </w:r>
+      <w:r>
+        <w:t>taCS</w:t>
+      </w:r>
       <w:r>
         <w:t>”</w:t>
       </w:r>
-      <w:proofErr w:type="gramEnd"/>
-      <w:r>
-        <w:rPr>
-          <w:rFonts w:hint="eastAsia"/>
-        </w:rPr>
-        <w:t>S3_</w:t>
-      </w:r>
-      <w:proofErr w:type="gramStart"/>
+      <w:r>
+        <w:rPr>
+          <w:rFonts w:hint="eastAsia"/>
+        </w:rPr>
+        <w:t>+</w:t>
+      </w:r>
       <w:r>
         <w:t>”</w:t>
       </w:r>
-      <w:proofErr w:type="gramEnd"/>
-      <w:r>
+      <w:r>
+        <w:t>_</w:t>
+      </w:r>
+      <w:r>
+        <w:rPr>
+          <w:rFonts w:hint="eastAsia"/>
+        </w:rPr>
+        <w:t>Time</w:t>
+      </w:r>
+      <w:r>
+        <w:t>”</w:t>
+      </w:r>
+      <w:r>
+        <w:rPr>
+          <w:rFonts w:hint="eastAsia"/>
+        </w:rPr>
+        <w:t>，该</w:t>
+      </w:r>
+      <w:r>
+        <w:t>Time</w:t>
+      </w:r>
+      <w:r>
+        <w:rPr>
+          <w:rFonts w:hint="eastAsia"/>
+        </w:rPr>
+        <w:t>根据创建区</w:t>
+      </w:r>
+      <w:r>
+        <w:rPr>
+          <w:rFonts w:hint="eastAsia"/>
+        </w:rPr>
+        <w:t>域时指定的数据</w:t>
+      </w:r>
+      <w:r>
+        <w:rPr>
+          <w:rFonts w:hint="eastAsia"/>
+        </w:rPr>
+        <w:t>集合空间创建周期及当前时间计算出来。如果系统当前不存在该集合空间，则创建集合空间，并将该集合空间名称记录到</w:t>
+      </w:r>
+      <w:r>
+        <w:t>S3_RegionSpace</w:t>
+      </w:r>
+      <w:r>
+        <w:rPr>
+          <w:rFonts w:hint="eastAsia"/>
+        </w:rPr>
+        <w:t>中</w:t>
+      </w:r>
+      <w:r>
+        <w:rPr>
+          <w:rFonts w:hint="eastAsia"/>
+        </w:rPr>
+        <w:t>（有冲突记录不报错，打印日志）。</w:t>
+      </w:r>
+      <w:r>
+        <w:rPr>
+          <w:rFonts w:hint="eastAsia"/>
+        </w:rPr>
+        <w:t>数据集合空间下的集合名称为</w:t>
+      </w:r>
+      <w:r>
+        <w:t>S3_ObjectData</w:t>
+      </w:r>
+      <w:r>
+        <w:rPr>
+          <w:rFonts w:hint="eastAsia"/>
+        </w:rPr>
         <w:t>+</w:t>
       </w:r>
       <w:r>
-        <w:rPr>
-          <w:rFonts w:hint="eastAsia"/>
-        </w:rPr>
-        <w:t>region</w:t>
-      </w:r>
-      <w:r>
-        <w:t>+</w:t>
-      </w:r>
-      <w:proofErr w:type="gramStart"/>
-      <w:r>
         <w:t>”</w:t>
       </w:r>
-      <w:proofErr w:type="gramEnd"/>
-      <w:r>
-        <w:t xml:space="preserve"> _MetaCS</w:t>
-      </w:r>
-      <w:proofErr w:type="gramStart"/>
+      <w:r>
+        <w:t>_Time</w:t>
+      </w:r>
       <w:r>
         <w:t>”</w:t>
       </w:r>
-      <w:proofErr w:type="gramEnd"/>
-      <w:r>
-        <w:rPr>
-          <w:rFonts w:hint="eastAsia"/>
-        </w:rPr>
-        <w:t>，如果区域配置中指定了</w:t>
-      </w:r>
-      <w:r>
-        <w:rPr>
-          <w:rFonts w:hint="eastAsia"/>
-        </w:rPr>
-        <w:t>MetaDomain</w:t>
-      </w:r>
-      <w:r>
-        <w:rPr>
-          <w:rFonts w:hint="eastAsia"/>
-        </w:rPr>
-        <w:t>，则该集合空间建立在</w:t>
-      </w:r>
-      <w:r>
-        <w:rPr>
-          <w:rFonts w:hint="eastAsia"/>
-        </w:rPr>
-        <w:t>MetaDomain</w:t>
-      </w:r>
-      <w:r>
-        <w:rPr>
-          <w:rFonts w:hint="eastAsia"/>
-        </w:rPr>
-        <w:t>指定的域上。</w:t>
+      <w:r>
+        <w:rPr>
+          <w:rFonts w:hint="eastAsia"/>
+        </w:rPr>
+        <w:t>，</w:t>
+      </w:r>
+      <w:r>
+        <w:rPr>
+          <w:rFonts w:hint="eastAsia"/>
+        </w:rPr>
+        <w:t>根据创建区域时指定的对象集合创建周期及当前时间计算得来，如果系统当前</w:t>
+      </w:r>
+      <w:r>
+        <w:rPr>
+          <w:rFonts w:hint="eastAsia"/>
+        </w:rPr>
+        <w:t>集合空间下</w:t>
+      </w:r>
+      <w:r>
+        <w:rPr>
+          <w:rFonts w:hint="eastAsia"/>
+        </w:rPr>
+        <w:t>不存在该集合，则创建集合</w:t>
+      </w:r>
+      <w:r>
+        <w:rPr>
+          <w:rFonts w:hint="eastAsia"/>
+        </w:rPr>
+        <w:t>。</w:t>
       </w:r>
     </w:p>
     <w:p>
@@ -20845,513 +20864,7 @@
         <w:rPr>
           <w:rFonts w:hint="eastAsia"/>
         </w:rPr>
-        <w:lastRenderedPageBreak/>
-        <w:t>元数据集合空间下的最新元数据集合名为</w:t>
-      </w:r>
-      <w:r>
-        <w:t>S3_ObjectMeta</w:t>
-      </w:r>
-      <w:r>
-        <w:rPr>
-          <w:rFonts w:hint="eastAsia"/>
-        </w:rPr>
-        <w:t>，历史元数据集合为</w:t>
-      </w:r>
-      <w:r>
-        <w:t>S3_ObjectMetaHistory</w:t>
-      </w:r>
-      <w:r>
-        <w:rPr>
-          <w:rFonts w:hint="eastAsia"/>
-        </w:rPr>
-        <w:t>，如果当前集合空间下不存在该集合，则创建集合。</w:t>
-      </w:r>
-    </w:p>
-    <w:p>
-      <w:pPr>
-        <w:spacing w:beforeLines="50" w:before="156" w:afterLines="50" w:after="156"/>
-        <w:ind w:left="0" w:firstLineChars="200" w:firstLine="420"/>
-      </w:pPr>
-      <w:r>
-        <w:rPr>
-          <w:rFonts w:hint="eastAsia"/>
-        </w:rPr>
-        <w:t>写入对象数据时</w:t>
-      </w:r>
-      <w:r>
-        <w:rPr>
-          <w:rFonts w:hint="eastAsia"/>
-        </w:rPr>
-        <w:t>会生成元数据的集合空间名称和集合名称，还会生成对象数据的集合空间和集合名称，将对象数据写入生成的</w:t>
-      </w:r>
-      <w:r>
-        <w:rPr>
-          <w:rFonts w:hint="eastAsia"/>
-        </w:rPr>
-        <w:t>对象数据集合</w:t>
-      </w:r>
-      <w:r>
-        <w:rPr>
-          <w:rFonts w:hint="eastAsia"/>
-        </w:rPr>
-        <w:t>，获取</w:t>
-      </w:r>
-      <w:r>
-        <w:rPr>
-          <w:rFonts w:hint="eastAsia"/>
-        </w:rPr>
-        <w:t>LobId</w:t>
-      </w:r>
-      <w:r>
-        <w:rPr>
-          <w:rFonts w:hint="eastAsia"/>
-        </w:rPr>
-        <w:t>，将对象数据</w:t>
-      </w:r>
-      <w:r>
-        <w:rPr>
-          <w:rFonts w:hint="eastAsia"/>
-        </w:rPr>
-        <w:t>集合空间，</w:t>
-      </w:r>
-      <w:r>
-        <w:rPr>
-          <w:rFonts w:hint="eastAsia"/>
-        </w:rPr>
-        <w:t>集合名称和</w:t>
-      </w:r>
-      <w:r>
-        <w:rPr>
-          <w:rFonts w:hint="eastAsia"/>
-        </w:rPr>
-        <w:t>LobId</w:t>
-      </w:r>
-      <w:r>
-        <w:rPr>
-          <w:rFonts w:hint="eastAsia"/>
-        </w:rPr>
-        <w:t>记录写入</w:t>
-      </w:r>
-      <w:r>
-        <w:rPr>
-          <w:rFonts w:hint="eastAsia"/>
-        </w:rPr>
-        <w:t>生成的</w:t>
-      </w:r>
-      <w:r>
-        <w:rPr>
-          <w:rFonts w:hint="eastAsia"/>
-        </w:rPr>
-        <w:t>元数据</w:t>
-      </w:r>
-      <w:r>
-        <w:rPr>
-          <w:rFonts w:hint="eastAsia"/>
-        </w:rPr>
-        <w:t>集合</w:t>
-      </w:r>
-      <w:r>
-        <w:rPr>
-          <w:rFonts w:hint="eastAsia"/>
-        </w:rPr>
-        <w:t>。</w:t>
-      </w:r>
-      <w:r>
-        <w:rPr>
-          <w:rFonts w:hint="eastAsia"/>
-        </w:rPr>
-        <w:t>当写入时报</w:t>
-      </w:r>
-      <w:r>
-        <w:rPr>
-          <w:rFonts w:hint="eastAsia"/>
-        </w:rPr>
-        <w:t>CS</w:t>
-      </w:r>
-      <w:r>
-        <w:rPr>
-          <w:rFonts w:hint="eastAsia"/>
-        </w:rPr>
-        <w:t>或</w:t>
-      </w:r>
-      <w:r>
-        <w:rPr>
-          <w:rFonts w:hint="eastAsia"/>
-        </w:rPr>
-        <w:t>CL</w:t>
-      </w:r>
-      <w:r>
-        <w:rPr>
-          <w:rFonts w:hint="eastAsia"/>
-        </w:rPr>
-        <w:t>不存在则创建相应的</w:t>
-      </w:r>
-      <w:r>
-        <w:rPr>
-          <w:rFonts w:hint="eastAsia"/>
-        </w:rPr>
-        <w:t>CS</w:t>
-      </w:r>
-      <w:r>
-        <w:rPr>
-          <w:rFonts w:hint="eastAsia"/>
-        </w:rPr>
-        <w:t>和</w:t>
-      </w:r>
-      <w:r>
-        <w:rPr>
-          <w:rFonts w:hint="eastAsia"/>
-        </w:rPr>
-        <w:t>CL</w:t>
-      </w:r>
-      <w:r>
-        <w:rPr>
-          <w:rFonts w:hint="eastAsia"/>
-        </w:rPr>
-        <w:t>。</w:t>
-      </w:r>
-      <w:r>
-        <w:rPr>
-          <w:rFonts w:hint="eastAsia"/>
-        </w:rPr>
-        <w:t xml:space="preserve">    </w:t>
-      </w:r>
-    </w:p>
-    <w:p>
-      <w:pPr>
-        <w:spacing w:beforeLines="50" w:before="156" w:afterLines="50" w:after="156"/>
-        <w:ind w:left="0" w:firstLineChars="200" w:firstLine="420"/>
-      </w:pPr>
-      <w:r>
-        <w:rPr>
-          <w:rFonts w:hint="eastAsia"/>
-        </w:rPr>
-        <w:t>如果配置文件中记录的对象数据集合空间如下，如果创建桶时不指定区域信息，</w:t>
-      </w:r>
-      <w:proofErr w:type="gramStart"/>
-      <w:r>
-        <w:rPr>
-          <w:rFonts w:hint="eastAsia"/>
-        </w:rPr>
-        <w:t>则对象</w:t>
-      </w:r>
-      <w:proofErr w:type="gramEnd"/>
-      <w:r>
-        <w:rPr>
-          <w:rFonts w:hint="eastAsia"/>
-        </w:rPr>
-        <w:t>数据存储在该集合空间下。</w:t>
-      </w:r>
-    </w:p>
-    <w:p>
-      <w:pPr>
-        <w:pStyle w:val="HTML"/>
-        <w:shd w:val="clear" w:color="auto" w:fill="2B2B2B"/>
-        <w:rPr>
-          <w:color w:val="A9B7C6"/>
-          <w:sz w:val="30"/>
-          <w:szCs w:val="30"/>
-        </w:rPr>
-      </w:pPr>
-      <w:r>
-        <w:rPr>
-          <w:rFonts w:hint="eastAsia"/>
-          <w:color w:val="CC7832"/>
-          <w:sz w:val="30"/>
-          <w:szCs w:val="30"/>
-        </w:rPr>
-        <w:t>sdbs3.sequoiadb.</w:t>
-      </w:r>
-      <w:proofErr w:type="gramStart"/>
-      <w:r>
-        <w:rPr>
-          <w:rFonts w:hint="eastAsia"/>
-          <w:color w:val="CC7832"/>
-          <w:sz w:val="30"/>
-          <w:szCs w:val="30"/>
-        </w:rPr>
-        <w:t>data.csName</w:t>
-      </w:r>
-      <w:proofErr w:type="gramEnd"/>
-      <w:r>
-        <w:rPr>
-          <w:rFonts w:hint="eastAsia"/>
-          <w:color w:val="808080"/>
-          <w:sz w:val="30"/>
-          <w:szCs w:val="30"/>
-        </w:rPr>
-        <w:t>=</w:t>
-      </w:r>
-      <w:r>
-        <w:rPr>
-          <w:color w:val="6A8759"/>
-          <w:sz w:val="30"/>
-          <w:szCs w:val="30"/>
-        </w:rPr>
-        <w:t>S3_SYS_Data</w:t>
-      </w:r>
-    </w:p>
-    <w:p>
-      <w:pPr>
-        <w:spacing w:beforeLines="50" w:before="156" w:afterLines="50" w:after="156"/>
-        <w:ind w:left="0" w:firstLineChars="200" w:firstLine="420"/>
-      </w:pPr>
-      <w:r>
-        <w:rPr>
-          <w:rFonts w:hint="eastAsia"/>
-        </w:rPr>
-        <w:t>如果创建桶时指定了区域信息，</w:t>
-      </w:r>
-      <w:r>
-        <w:rPr>
-          <w:rFonts w:hint="eastAsia"/>
-        </w:rPr>
-        <w:t>并且区域值为</w:t>
-      </w:r>
-      <w:r>
-        <w:rPr>
-          <w:rFonts w:hint="eastAsia"/>
-        </w:rPr>
-        <w:t>ShardingType</w:t>
-      </w:r>
-      <w:r>
-        <w:rPr>
-          <w:rFonts w:hint="eastAsia"/>
-        </w:rPr>
-        <w:t>模式，</w:t>
-      </w:r>
-      <w:r>
-        <w:rPr>
-          <w:rFonts w:hint="eastAsia"/>
-        </w:rPr>
-        <w:t>则创建</w:t>
-      </w:r>
-      <w:r>
-        <w:rPr>
-          <w:rFonts w:hint="eastAsia"/>
-        </w:rPr>
-        <w:t>数据集合空间为</w:t>
-      </w:r>
-      <w:proofErr w:type="gramStart"/>
-      <w:r>
-        <w:t>”</w:t>
-      </w:r>
-      <w:proofErr w:type="gramEnd"/>
-      <w:r>
-        <w:t>S3</w:t>
-      </w:r>
-      <w:r>
-        <w:rPr>
-          <w:rFonts w:hint="eastAsia"/>
-        </w:rPr>
-        <w:t>_</w:t>
-      </w:r>
-      <w:proofErr w:type="gramStart"/>
-      <w:r>
-        <w:t>”</w:t>
-      </w:r>
-      <w:proofErr w:type="gramEnd"/>
-      <w:r>
-        <w:t>+</w:t>
-      </w:r>
-      <w:r>
-        <w:rPr>
-          <w:rFonts w:hint="eastAsia"/>
-        </w:rPr>
-        <w:t>region</w:t>
-      </w:r>
-      <w:r>
-        <w:t>+</w:t>
-      </w:r>
-      <w:proofErr w:type="gramStart"/>
-      <w:r>
-        <w:t>”</w:t>
-      </w:r>
-      <w:proofErr w:type="gramEnd"/>
-      <w:r>
-        <w:t xml:space="preserve"> </w:t>
-      </w:r>
-      <w:r>
-        <w:t>_</w:t>
-      </w:r>
-      <w:r>
-        <w:rPr>
-          <w:rFonts w:hint="eastAsia"/>
-        </w:rPr>
-        <w:t>Da</w:t>
-      </w:r>
-      <w:r>
-        <w:t>taCS</w:t>
-      </w:r>
-      <w:proofErr w:type="gramStart"/>
-      <w:r>
-        <w:t>”</w:t>
-      </w:r>
-      <w:proofErr w:type="gramEnd"/>
-      <w:r>
-        <w:rPr>
-          <w:rFonts w:hint="eastAsia"/>
-        </w:rPr>
-        <w:t>+</w:t>
-      </w:r>
-      <w:proofErr w:type="gramStart"/>
-      <w:r>
-        <w:t>”</w:t>
-      </w:r>
-      <w:proofErr w:type="gramEnd"/>
-      <w:r>
-        <w:t>_</w:t>
-      </w:r>
-      <w:r>
-        <w:rPr>
-          <w:rFonts w:hint="eastAsia"/>
-        </w:rPr>
-        <w:t>Time</w:t>
-      </w:r>
-      <w:proofErr w:type="gramStart"/>
-      <w:r>
-        <w:t>”</w:t>
-      </w:r>
-      <w:proofErr w:type="gramEnd"/>
-      <w:r>
-        <w:rPr>
-          <w:rFonts w:hint="eastAsia"/>
-        </w:rPr>
-        <w:t>，该</w:t>
-      </w:r>
-      <w:r>
-        <w:t>Time</w:t>
-      </w:r>
-      <w:r>
-        <w:rPr>
-          <w:rFonts w:hint="eastAsia"/>
-        </w:rPr>
-        <w:t>根据创建区</w:t>
-      </w:r>
-      <w:r>
-        <w:rPr>
-          <w:rFonts w:hint="eastAsia"/>
-        </w:rPr>
-        <w:t>域时指定的数据</w:t>
-      </w:r>
-      <w:r>
-        <w:rPr>
-          <w:rFonts w:hint="eastAsia"/>
-        </w:rPr>
-        <w:t>集合空间创建周期及当前时间计算出来。如果系统当前不存在该集合空间，则创建集合空间，并将该集合空间名称记录到</w:t>
-      </w:r>
-      <w:r>
-        <w:t>S3_RegionSpace</w:t>
-      </w:r>
-      <w:r>
-        <w:rPr>
-          <w:rFonts w:hint="eastAsia"/>
-        </w:rPr>
-        <w:t>中</w:t>
-      </w:r>
-      <w:r>
-        <w:rPr>
-          <w:rFonts w:hint="eastAsia"/>
-        </w:rPr>
-        <w:t>（有冲突记录不报错，打印日志）。</w:t>
-      </w:r>
-      <w:r>
-        <w:rPr>
-          <w:rFonts w:hint="eastAsia"/>
-        </w:rPr>
-        <w:t>数据集合空间下的集合名称为</w:t>
-      </w:r>
-      <w:r>
-        <w:t>S3_ObjectData</w:t>
-      </w:r>
-      <w:r>
-        <w:rPr>
-          <w:rFonts w:hint="eastAsia"/>
-        </w:rPr>
-        <w:t>+</w:t>
-      </w:r>
-      <w:proofErr w:type="gramStart"/>
-      <w:r>
-        <w:t>”</w:t>
-      </w:r>
-      <w:proofErr w:type="gramEnd"/>
-      <w:r>
-        <w:t>_Time</w:t>
-      </w:r>
-      <w:proofErr w:type="gramStart"/>
-      <w:r>
-        <w:t>”</w:t>
-      </w:r>
-      <w:proofErr w:type="gramEnd"/>
-      <w:r>
-        <w:rPr>
-          <w:rFonts w:hint="eastAsia"/>
-        </w:rPr>
-        <w:t>，</w:t>
-      </w:r>
-      <w:r>
-        <w:rPr>
-          <w:rFonts w:hint="eastAsia"/>
-        </w:rPr>
-        <w:t>根据创建区域时指定的对象集合创建周期及当前时间计算得来，如果系统当前</w:t>
-      </w:r>
-      <w:r>
-        <w:rPr>
-          <w:rFonts w:hint="eastAsia"/>
-        </w:rPr>
-        <w:t>集合空间下</w:t>
-      </w:r>
-      <w:r>
-        <w:rPr>
-          <w:rFonts w:hint="eastAsia"/>
-        </w:rPr>
-        <w:t>不存在该集合，则创建集合</w:t>
-      </w:r>
-      <w:r>
-        <w:rPr>
-          <w:rFonts w:hint="eastAsia"/>
-        </w:rPr>
-        <w:t>。</w:t>
-      </w:r>
-    </w:p>
-    <w:p>
-      <w:pPr>
-        <w:spacing w:beforeLines="50" w:before="156" w:afterLines="50" w:after="156"/>
-        <w:ind w:left="0" w:firstLineChars="200" w:firstLine="420"/>
-      </w:pPr>
-      <w:r>
-        <w:rPr>
-          <w:rFonts w:hint="eastAsia"/>
-        </w:rPr>
-        <w:t>如果创建桶时指定了区域信息，</w:t>
-      </w:r>
-      <w:proofErr w:type="gramStart"/>
-      <w:r>
-        <w:rPr>
-          <w:rFonts w:hint="eastAsia"/>
-        </w:rPr>
-        <w:t>且区域</w:t>
-      </w:r>
-      <w:proofErr w:type="gramEnd"/>
-      <w:r>
-        <w:rPr>
-          <w:rFonts w:hint="eastAsia"/>
-        </w:rPr>
-        <w:t>配置为指定模式，</w:t>
-      </w:r>
-      <w:proofErr w:type="gramStart"/>
-      <w:r>
-        <w:rPr>
-          <w:rFonts w:hint="eastAsia"/>
-        </w:rPr>
-        <w:t>则数据</w:t>
-      </w:r>
-      <w:proofErr w:type="gramEnd"/>
-      <w:r>
-        <w:rPr>
-          <w:rFonts w:hint="eastAsia"/>
-        </w:rPr>
-        <w:t>集合空间和元数据集合空间</w:t>
+        <w:t>如果创建桶时指定了区域信息，且区域配置为指定模式，则数据集合空间和元数据集合空间</w:t>
       </w:r>
       <w:r>
         <w:rPr>
@@ -21595,9 +21108,6 @@
     <w:p>
       <w:pPr>
         <w:ind w:left="0"/>
-        <w:rPr>
-          <w:rFonts w:hint="eastAsia"/>
-        </w:rPr>
       </w:pPr>
       <w:r>
         <w:rPr>
@@ -21771,21 +21281,7 @@
         <w:rPr>
           <w:rFonts w:hint="eastAsia"/>
         </w:rPr>
-        <w:t>结果时就会锁定记录，只有当事务提交或者</w:t>
-      </w:r>
-      <w:proofErr w:type="gramStart"/>
-      <w:r>
-        <w:rPr>
-          <w:rFonts w:hint="eastAsia"/>
-        </w:rPr>
-        <w:t>回滚才</w:t>
-      </w:r>
-      <w:proofErr w:type="gramEnd"/>
-      <w:r>
-        <w:rPr>
-          <w:rFonts w:hint="eastAsia"/>
-        </w:rPr>
-        <w:t>会解锁</w:t>
+        <w:t>结果时就会锁定记录，只有当事务提交或者回滚才会解锁</w:t>
       </w:r>
       <w:r>
         <w:rPr>
@@ -21819,35 +21315,7 @@
         <w:rPr>
           <w:rFonts w:hint="eastAsia"/>
         </w:rPr>
-        <w:t>先将</w:t>
-      </w:r>
-      <w:proofErr w:type="gramStart"/>
-      <w:r>
-        <w:rPr>
-          <w:rFonts w:hint="eastAsia"/>
-        </w:rPr>
-        <w:t>原最新</w:t>
-      </w:r>
-      <w:proofErr w:type="gramEnd"/>
-      <w:r>
-        <w:rPr>
-          <w:rFonts w:hint="eastAsia"/>
-        </w:rPr>
-        <w:t>元数据写入历史元数据表，再更新最新元数据，避免</w:t>
-      </w:r>
-      <w:proofErr w:type="gramStart"/>
-      <w:r>
-        <w:rPr>
-          <w:rFonts w:hint="eastAsia"/>
-        </w:rPr>
-        <w:t>原最新</w:t>
-      </w:r>
-      <w:proofErr w:type="gramEnd"/>
-      <w:r>
-        <w:rPr>
-          <w:rFonts w:hint="eastAsia"/>
-        </w:rPr>
-        <w:t>元数据在一部分时刻在最新元数据表和历史元数据表都查询不到任何关于此版本的记录。</w:t>
+        <w:t>先将原最新元数据写入历史元数据表，再更新最新元数据，避免原最新元数据在一部分时刻在最新元数据表和历史元数据表都查询不到任何关于此版本的记录。</w:t>
       </w:r>
     </w:p>
     <w:p>
@@ -21858,29 +21326,12 @@
           <w:numId w:val="53"/>
         </w:numPr>
         <w:ind w:firstLineChars="0"/>
-        <w:rPr>
-          <w:rFonts w:hint="eastAsia"/>
-        </w:rPr>
-      </w:pPr>
-      <w:r>
-        <w:rPr>
-          <w:rFonts w:hint="eastAsia"/>
-        </w:rPr>
-        <w:t>当对象所属</w:t>
-      </w:r>
-      <w:proofErr w:type="gramStart"/>
-      <w:r>
-        <w:rPr>
-          <w:rFonts w:hint="eastAsia"/>
-        </w:rPr>
-        <w:t>桶同时</w:t>
-      </w:r>
-      <w:proofErr w:type="gramEnd"/>
-      <w:r>
-        <w:rPr>
-          <w:rFonts w:hint="eastAsia"/>
-        </w:rPr>
-        <w:t>存在两个非删除状态的分隔符时，增加新对象时要根据两个分隔符分别建目录。</w:t>
+      </w:pPr>
+      <w:r>
+        <w:rPr>
+          <w:rFonts w:hint="eastAsia"/>
+        </w:rPr>
+        <w:t>当对象所属桶同时存在两个非删除状态的分隔符时，增加新对象时要根据两个分隔符分别建目录。</w:t>
       </w:r>
     </w:p>
     <w:p>
@@ -22042,19 +21493,11 @@
         </w:rPr>
         <w:t>PUT</w:t>
       </w:r>
-      <w:proofErr w:type="gramStart"/>
-      <w:r>
-        <w:rPr>
-          <w:rFonts w:hint="eastAsia"/>
-        </w:rPr>
-        <w:t>操作再</w:t>
-      </w:r>
-      <w:proofErr w:type="gramEnd"/>
-      <w:r>
-        <w:rPr>
-          <w:rFonts w:hint="eastAsia"/>
-        </w:rPr>
-        <w:t>执行</w:t>
+      <w:r>
+        <w:rPr>
+          <w:rFonts w:hint="eastAsia"/>
+        </w:rPr>
+        <w:t>操作再执行</w:t>
       </w:r>
       <w:r>
         <w:rPr>
@@ -22108,21 +21551,7 @@
         <w:rPr>
           <w:rFonts w:hint="eastAsia"/>
         </w:rPr>
-        <w:t>操作在处理同一个对象，查询元数据时发现已经有该对象的记录，则上</w:t>
-      </w:r>
-      <w:proofErr w:type="gramStart"/>
-      <w:r>
-        <w:rPr>
-          <w:rFonts w:hint="eastAsia"/>
-        </w:rPr>
-        <w:t>传对象</w:t>
-      </w:r>
-      <w:proofErr w:type="gramEnd"/>
-      <w:r>
-        <w:rPr>
-          <w:rFonts w:hint="eastAsia"/>
-        </w:rPr>
-        <w:t>后使用</w:t>
+        <w:t>操作在处理同一个对象，查询元数据时发现已经有该对象的记录，则上传对象后使用</w:t>
       </w:r>
       <w:r>
         <w:rPr>
@@ -22568,71 +21997,18 @@
         <w:rPr>
           <w:rFonts w:hint="eastAsia"/>
         </w:rPr>
-        <w:t>查询对象列表有两种方式查询，一种是目录表扫描查询，一种是元数据表扫描查询。当请求中携带分隔符，并且与当前桶的分隔符匹配，</w:t>
-      </w:r>
-      <w:proofErr w:type="gramStart"/>
-      <w:r>
-        <w:rPr>
-          <w:rFonts w:hint="eastAsia"/>
-        </w:rPr>
-        <w:t>且桶的</w:t>
-      </w:r>
-      <w:proofErr w:type="gramEnd"/>
-      <w:r>
-        <w:rPr>
-          <w:rFonts w:hint="eastAsia"/>
-        </w:rPr>
-        <w:t>分隔符状态为可用时，</w:t>
-      </w:r>
-      <w:proofErr w:type="gramStart"/>
-      <w:r>
-        <w:rPr>
-          <w:rFonts w:hint="eastAsia"/>
-        </w:rPr>
-        <w:t>旧可以</w:t>
-      </w:r>
-      <w:proofErr w:type="gramEnd"/>
-      <w:r>
-        <w:rPr>
-          <w:rFonts w:hint="eastAsia"/>
-        </w:rPr>
-        <w:t>通过目录表扫描查询。如果没有携带分隔符或者分隔符不匹配或者匹配的分隔符状态</w:t>
-      </w:r>
-      <w:proofErr w:type="gramStart"/>
-      <w:r>
-        <w:rPr>
-          <w:rFonts w:hint="eastAsia"/>
-        </w:rPr>
-        <w:t>不</w:t>
-      </w:r>
-      <w:proofErr w:type="gramEnd"/>
-      <w:r>
-        <w:rPr>
-          <w:rFonts w:hint="eastAsia"/>
-        </w:rPr>
-        <w:t>可用，则通过扫描元数据表的方式查询。</w:t>
+        <w:t>查询对象列表有两种方式查询，一种是目录表扫描查询，一种是元数据表扫描查询。当请求中携带分隔符，并且与当前桶的分隔符匹配，且桶的分隔符状态为可用时，旧可以通过目录表扫描查询。如果没有携带分隔符或者分隔符不匹配或者匹配的分隔符状态不可用，则通过扫描元数据表的方式查询。</w:t>
       </w:r>
     </w:p>
     <w:p>
       <w:pPr>
         <w:ind w:left="0"/>
-        <w:rPr>
-          <w:rFonts w:hint="eastAsia"/>
-        </w:rPr>
-      </w:pPr>
-      <w:proofErr w:type="gramStart"/>
-      <w:r>
-        <w:rPr>
-          <w:rFonts w:hint="eastAsia"/>
-        </w:rPr>
-        <w:t>一</w:t>
-      </w:r>
-      <w:proofErr w:type="gramEnd"/>
-      <w:r>
-        <w:rPr>
-          <w:rFonts w:hint="eastAsia"/>
-        </w:rPr>
-        <w:t>：扫描元数据表方式</w:t>
+      </w:pPr>
+      <w:r>
+        <w:rPr>
+          <w:rFonts w:hint="eastAsia"/>
+        </w:rPr>
+        <w:t>一：扫描元数据表方式</w:t>
       </w:r>
     </w:p>
     <w:p>
@@ -24087,21 +23463,7 @@
         <w:rPr>
           <w:rFonts w:hint="eastAsia"/>
         </w:rPr>
-        <w:t>引，</w:t>
-      </w:r>
-      <w:proofErr w:type="gramStart"/>
-      <w:r>
-        <w:rPr>
-          <w:rFonts w:hint="eastAsia"/>
-        </w:rPr>
-        <w:t>每分配</w:t>
-      </w:r>
-      <w:proofErr w:type="gramEnd"/>
-      <w:r>
-        <w:rPr>
-          <w:rFonts w:hint="eastAsia"/>
-        </w:rPr>
-        <w:t>一个上下文，</w:t>
+        <w:t>引，每分配一个上下文，</w:t>
       </w:r>
       <w:r>
         <w:rPr>
@@ -25504,23 +24866,7 @@
           <w:rFonts w:hint="eastAsia"/>
           <w:bCs/>
         </w:rPr>
-        <w:t>在桶内未配置或已配置但当前状态</w:t>
-      </w:r>
-      <w:proofErr w:type="gramStart"/>
-      <w:r>
-        <w:rPr>
-          <w:rFonts w:hint="eastAsia"/>
-          <w:bCs/>
-        </w:rPr>
-        <w:t>不</w:t>
-      </w:r>
-      <w:proofErr w:type="gramEnd"/>
-      <w:r>
-        <w:rPr>
-          <w:rFonts w:hint="eastAsia"/>
-          <w:bCs/>
-        </w:rPr>
-        <w:t>可用，则使用原始匹配法。</w:t>
+        <w:t>在桶内未配置或已配置但当前状态不可用，则使用原始匹配法。</w:t>
       </w:r>
     </w:p>
     <w:p>
@@ -25556,7 +24902,6 @@
       <w:pPr>
         <w:ind w:left="0" w:firstLineChars="200" w:firstLine="420"/>
         <w:rPr>
-          <w:rFonts w:hint="eastAsia"/>
           <w:bCs/>
         </w:rPr>
       </w:pPr>
@@ -25646,13 +24991,7 @@
         <w:rPr>
           <w:rFonts w:hint="eastAsia"/>
         </w:rPr>
-        <w:t>条件时</w:t>
-      </w:r>
-      <w:r>
-        <w:rPr>
-          <w:rFonts w:hint="eastAsia"/>
-        </w:rPr>
-        <w:t>，首先将</w:t>
+        <w:t>条件时，首先将</w:t>
       </w:r>
       <w:r>
         <w:rPr>
@@ -25688,21 +25027,7 @@
         <w:rPr>
           <w:rFonts w:hint="eastAsia"/>
         </w:rPr>
-        <w:t>的</w:t>
-      </w:r>
-      <w:proofErr w:type="gramStart"/>
-      <w:r>
-        <w:rPr>
-          <w:rFonts w:hint="eastAsia"/>
-        </w:rPr>
-        <w:t>最</w:t>
-      </w:r>
-      <w:proofErr w:type="gramEnd"/>
-      <w:r>
-        <w:rPr>
-          <w:rFonts w:hint="eastAsia"/>
-        </w:rPr>
-        <w:t>底层目录及所有子目录</w:t>
+        <w:t>的最底层目录及所有子目录</w:t>
       </w:r>
       <w:r>
         <w:rPr>
@@ -25744,21 +25069,7 @@
         <w:rPr>
           <w:rFonts w:hint="eastAsia"/>
         </w:rPr>
-        <w:t>时，</w:t>
-      </w:r>
-      <w:proofErr w:type="gramStart"/>
-      <w:r>
-        <w:rPr>
-          <w:rFonts w:hint="eastAsia"/>
-        </w:rPr>
-        <w:t>最</w:t>
-      </w:r>
-      <w:proofErr w:type="gramEnd"/>
-      <w:r>
-        <w:rPr>
-          <w:rFonts w:hint="eastAsia"/>
-        </w:rPr>
-        <w:t>底层目录为</w:t>
+        <w:t>时，最底层目录为</w:t>
       </w:r>
       <w:r>
         <w:rPr>
@@ -26288,19 +25599,11 @@
         </w:rPr>
         <w:t>key</w:t>
       </w:r>
-      <w:proofErr w:type="gramStart"/>
-      <w:r>
-        <w:rPr>
-          <w:rFonts w:hint="eastAsia"/>
-        </w:rPr>
-        <w:t>值记录</w:t>
-      </w:r>
-      <w:proofErr w:type="gramEnd"/>
-      <w:r>
-        <w:rPr>
-          <w:rFonts w:hint="eastAsia"/>
-        </w:rPr>
-        <w:t>排序）。</w:t>
+      <w:r>
+        <w:rPr>
+          <w:rFonts w:hint="eastAsia"/>
+        </w:rPr>
+        <w:t>值记录排序）。</w:t>
       </w:r>
     </w:p>
     <w:p>
@@ -27217,6 +26520,13 @@
           <w:noProof/>
         </w:rPr>
         <w:lastRenderedPageBreak/>
+        <w:t>过滤器中</w:t>
+      </w:r>
+      <w:r>
+        <w:rPr>
+          <w:rFonts w:hint="eastAsia"/>
+          <w:noProof/>
+        </w:rPr>
         <w:t>带</w:t>
       </w:r>
       <w:r>
@@ -27257,14 +26567,13 @@
       </w:pPr>
       <w:r>
         <w:rPr>
-          <w:rFonts w:hint="eastAsia"/>
           <w:noProof/>
         </w:rPr>
         <w:drawing>
-          <wp:inline distT="0" distB="0" distL="0" distR="0" wp14:anchorId="5E6791D7" wp14:editId="3F342A3F">
-            <wp:extent cx="5274310" cy="5296022"/>
+          <wp:inline distT="0" distB="0" distL="0" distR="0" wp14:anchorId="3A82FDF9" wp14:editId="6C7DB3BC">
+            <wp:extent cx="5274310" cy="5894408"/>
             <wp:effectExtent l="0" t="0" r="2540" b="0"/>
-            <wp:docPr id="18" name="图片 18"/>
+            <wp:docPr id="3" name="图片 3"/>
             <wp:cNvGraphicFramePr>
               <a:graphicFrameLocks xmlns:a="http://schemas.openxmlformats.org/drawingml/2006/main" noChangeAspect="1"/>
             </wp:cNvGraphicFramePr>
@@ -27272,7 +26581,7 @@
               <a:graphicData uri="http://schemas.openxmlformats.org/drawingml/2006/picture">
                 <pic:pic xmlns:pic="http://schemas.openxmlformats.org/drawingml/2006/picture">
                   <pic:nvPicPr>
-                    <pic:cNvPr id="0" name="Picture 10"/>
+                    <pic:cNvPr id="0" name="Picture 3"/>
                     <pic:cNvPicPr>
                       <a:picLocks noChangeAspect="1" noChangeArrowheads="1"/>
                     </pic:cNvPicPr>
@@ -27293,7 +26602,7 @@
                   <pic:spPr bwMode="auto">
                     <a:xfrm>
                       <a:off x="0" y="0"/>
-                      <a:ext cx="5274310" cy="5296022"/>
+                      <a:ext cx="5274310" cy="5894408"/>
                     </a:xfrm>
                     <a:prstGeom prst="rect">
                       <a:avLst/>
@@ -27322,6 +26631,13 @@
           <w:rFonts w:hint="eastAsia"/>
           <w:noProof/>
         </w:rPr>
+        <w:t>过滤器中</w:t>
+      </w:r>
+      <w:r>
+        <w:rPr>
+          <w:rFonts w:hint="eastAsia"/>
+          <w:noProof/>
+        </w:rPr>
         <w:t>带</w:t>
       </w:r>
       <w:r>
@@ -27350,21 +26666,7 @@
           <w:rFonts w:hint="eastAsia"/>
           <w:noProof/>
         </w:rPr>
-        <w:t>查询的查询第一条</w:t>
-      </w:r>
-      <w:r>
-        <w:rPr>
-          <w:rFonts w:hint="eastAsia"/>
-          <w:noProof/>
-        </w:rPr>
-        <w:t>之后</w:t>
-      </w:r>
-      <w:r>
-        <w:rPr>
-          <w:rFonts w:hint="eastAsia"/>
-          <w:noProof/>
-        </w:rPr>
-        <w:t>数据流程：</w:t>
+        <w:t>查询的查询第一条之后数据流程：</w:t>
       </w:r>
     </w:p>
     <w:p>
@@ -27380,10 +26682,10 @@
         </w:rPr>
         <w:lastRenderedPageBreak/>
         <w:drawing>
-          <wp:inline distT="0" distB="0" distL="0" distR="0" wp14:anchorId="6525BBD0" wp14:editId="2005CC91">
-            <wp:extent cx="5274310" cy="4411027"/>
-            <wp:effectExtent l="0" t="0" r="2540" b="8890"/>
-            <wp:docPr id="19" name="图片 19"/>
+          <wp:inline distT="0" distB="0" distL="0" distR="0" wp14:anchorId="273A21C6" wp14:editId="1572A3DE">
+            <wp:extent cx="5274310" cy="4451841"/>
+            <wp:effectExtent l="0" t="0" r="2540" b="6350"/>
+            <wp:docPr id="8" name="图片 8"/>
             <wp:cNvGraphicFramePr>
               <a:graphicFrameLocks xmlns:a="http://schemas.openxmlformats.org/drawingml/2006/main" noChangeAspect="1"/>
             </wp:cNvGraphicFramePr>
@@ -27391,7 +26693,7 @@
               <a:graphicData uri="http://schemas.openxmlformats.org/drawingml/2006/picture">
                 <pic:pic xmlns:pic="http://schemas.openxmlformats.org/drawingml/2006/picture">
                   <pic:nvPicPr>
-                    <pic:cNvPr id="0" name="Picture 11"/>
+                    <pic:cNvPr id="0" name="Picture 4"/>
                     <pic:cNvPicPr>
                       <a:picLocks noChangeAspect="1" noChangeArrowheads="1"/>
                     </pic:cNvPicPr>
@@ -27412,7 +26714,7 @@
                   <pic:spPr bwMode="auto">
                     <a:xfrm>
                       <a:off x="0" y="0"/>
-                      <a:ext cx="5274310" cy="4411027"/>
+                      <a:ext cx="5274310" cy="4451841"/>
                     </a:xfrm>
                     <a:prstGeom prst="rect">
                       <a:avLst/>
@@ -27428,6 +26730,8 @@
           </wp:inline>
         </w:drawing>
       </w:r>
+      <w:bookmarkStart w:id="6" w:name="_GoBack"/>
+      <w:bookmarkEnd w:id="6"/>
     </w:p>
     <w:p>
       <w:pPr>
@@ -27547,42 +26851,13 @@
           <w:rFonts w:hint="eastAsia"/>
           <w:noProof/>
         </w:rPr>
-        <w:t>的原始匹配法获取</w:t>
-      </w:r>
-      <w:r>
-        <w:rPr>
-          <w:rFonts w:hint="eastAsia"/>
-          <w:noProof/>
-        </w:rPr>
-        <w:t>第</w:t>
-      </w:r>
-      <w:r>
-        <w:rPr>
-          <w:rFonts w:hint="eastAsia"/>
-          <w:noProof/>
-        </w:rPr>
-        <w:t>一条</w:t>
-      </w:r>
-      <w:r>
-        <w:rPr>
-          <w:rFonts w:hint="eastAsia"/>
-          <w:noProof/>
-        </w:rPr>
-        <w:t>之后的</w:t>
-      </w:r>
-      <w:r>
-        <w:rPr>
-          <w:rFonts w:hint="eastAsia"/>
-          <w:noProof/>
-        </w:rPr>
-        <w:t>数据：</w:t>
+        <w:t>的原始匹配法获取第一条之后的数据：</w:t>
       </w:r>
     </w:p>
     <w:p>
       <w:pPr>
         <w:ind w:left="0"/>
         <w:rPr>
-          <w:rFonts w:hint="eastAsia"/>
           <w:noProof/>
         </w:rPr>
       </w:pPr>
@@ -27591,7 +26866,6 @@
       <w:pPr>
         <w:ind w:left="0"/>
         <w:rPr>
-          <w:rFonts w:hint="eastAsia"/>
           <w:noProof/>
         </w:rPr>
       </w:pPr>
@@ -29332,9 +28606,7 @@
         <w:pStyle w:val="3"/>
         <w:ind w:left="630"/>
       </w:pPr>
-      <w:bookmarkStart w:id="6" w:name="_删除对象（DELETE_Object）"/>
-      <w:bookmarkStart w:id="7" w:name="_GoBack"/>
-      <w:bookmarkEnd w:id="6"/>
+      <w:bookmarkStart w:id="7" w:name="_删除对象（DELETE_Object）"/>
       <w:bookmarkEnd w:id="7"/>
       <w:r>
         <w:rPr>
@@ -30711,9 +29983,6 @@
       <w:pPr>
         <w:spacing w:beforeLines="50" w:before="156" w:afterLines="50" w:after="156"/>
         <w:ind w:left="0"/>
-        <w:rPr>
-          <w:rFonts w:hint="eastAsia"/>
-        </w:rPr>
       </w:pPr>
       <w:r>
         <w:rPr>
@@ -32454,14 +31723,12 @@
             <w:pPr>
               <w:ind w:left="0"/>
             </w:pPr>
-            <w:proofErr w:type="gramStart"/>
             <w:r>
               <w:rPr>
                 <w:rFonts w:hint="eastAsia"/>
               </w:rPr>
               <w:t>桶名</w:t>
             </w:r>
-            <w:proofErr w:type="gramEnd"/>
             <w:r>
               <w:rPr>
                 <w:rFonts w:hint="eastAsia"/>
@@ -33000,16 +32267,8 @@
               <w:rPr>
                 <w:rFonts w:hint="eastAsia"/>
               </w:rPr>
-              <w:t>执行一次上</w:t>
-            </w:r>
-            <w:proofErr w:type="gramStart"/>
-            <w:r>
-              <w:rPr>
-                <w:rFonts w:hint="eastAsia"/>
-              </w:rPr>
-              <w:t>传对象</w:t>
-            </w:r>
-            <w:proofErr w:type="gramEnd"/>
+              <w:t>执行一次上传对象</w:t>
+            </w:r>
           </w:p>
         </w:tc>
         <w:tc>
@@ -33216,16 +32475,8 @@
               <w:rPr>
                 <w:rFonts w:hint="eastAsia"/>
               </w:rPr>
-              <w:t>多次上</w:t>
-            </w:r>
-            <w:proofErr w:type="gramStart"/>
-            <w:r>
-              <w:rPr>
-                <w:rFonts w:hint="eastAsia"/>
-              </w:rPr>
-              <w:t>传不同</w:t>
-            </w:r>
-            <w:proofErr w:type="gramEnd"/>
+              <w:t>多次上传不同</w:t>
+            </w:r>
             <w:r>
               <w:rPr>
                 <w:rFonts w:hint="eastAsia"/>
@@ -40351,6 +39602,7 @@
         <w:docPartUnique/>
       </w:docPartObj>
     </w:sdtPr>
+    <w:sdtEndPr/>
     <w:sdtContent>
       <w:p>
         <w:pPr>
@@ -40371,7 +39623,7 @@
             <w:noProof/>
             <w:lang w:val="zh-CN"/>
           </w:rPr>
-          <w:t>49</w:t>
+          <w:t>43</w:t>
         </w:r>
         <w:r>
           <w:fldChar w:fldCharType="end"/>
@@ -46925,7 +46177,7 @@
 </file>
 
 <file path=customXml/itemProps1.xml><?xml version="1.0" encoding="utf-8"?>
-<ds:datastoreItem xmlns:ds="http://schemas.openxmlformats.org/officeDocument/2006/customXml" ds:itemID="{34A6445A-0CC2-4048-8CCE-FE8F90957E0A}">
+<ds:datastoreItem xmlns:ds="http://schemas.openxmlformats.org/officeDocument/2006/customXml" ds:itemID="{10FB7D85-72A0-429C-9744-0738F33B5283}">
   <ds:schemaRefs>
     <ds:schemaRef ds:uri="http://schemas.openxmlformats.org/officeDocument/2006/bibliography"/>
   </ds:schemaRefs>

</xml_diff>